<commit_message>
Gone up to Kickers in the changelog
</commit_message>
<xml_diff>
--- a/Coursework/Course work write up 1.docx
+++ b/Coursework/Course work write up 1.docx
@@ -2031,7 +2031,7 @@
                     <pic:cNvPicPr/>
                   </pic:nvPicPr>
                   <pic:blipFill>
-                    <a:blip r:embed="rId9"/>
+                    <a:blip r:embed="rId11"/>
                     <a:stretch>
                       <a:fillRect/>
                     </a:stretch>
@@ -2960,7 +2960,7 @@
                     <pic:cNvPicPr/>
                   </pic:nvPicPr>
                   <pic:blipFill>
-                    <a:blip r:embed="rId10"/>
+                    <a:blip r:embed="rId12"/>
                     <a:stretch>
                       <a:fillRect/>
                     </a:stretch>
@@ -3321,7 +3321,7 @@
                     </pic:cNvPicPr>
                   </pic:nvPicPr>
                   <pic:blipFill>
-                    <a:blip r:embed="rId11">
+                    <a:blip r:embed="rId13">
                       <a:extLst>
                         <a:ext uri="{28A0092B-C50C-407E-A947-70E740481C1C}">
                           <a14:useLocalDpi xmlns:a14="http://schemas.microsoft.com/office/drawing/2010/main" val="0"/>
@@ -3435,7 +3435,7 @@
                     </pic:cNvPicPr>
                   </pic:nvPicPr>
                   <pic:blipFill>
-                    <a:blip r:embed="rId12">
+                    <a:blip r:embed="rId14">
                       <a:extLst>
                         <a:ext uri="{28A0092B-C50C-407E-A947-70E740481C1C}">
                           <a14:useLocalDpi xmlns:a14="http://schemas.microsoft.com/office/drawing/2010/main" val="0"/>
@@ -4042,15 +4042,7 @@
       </w:r>
       <w:proofErr w:type="spellEnd"/>
       <w:r>
-        <w:t xml:space="preserve"> and </w:t>
-      </w:r>
-      <w:proofErr w:type="spellStart"/>
-      <w:r>
-        <w:t>Num_list</w:t>
-      </w:r>
-      <w:proofErr w:type="spellEnd"/>
-      <w:r>
-        <w:t xml:space="preserve"> to pull from. Finally, both lists are sorted alphabetically/numerically.</w:t>
+        <w:t xml:space="preserve"> and Num_list to pull from. Finally, both lists are sorted alphabetically/numerically.</w:t>
       </w:r>
     </w:p>
     <w:p>
@@ -4377,31 +4369,15 @@
     </w:p>
     <w:p>
       <w:r>
-        <w:t xml:space="preserve">If </w:t>
+        <w:t>If Num_list[</w:t>
       </w:r>
       <w:proofErr w:type="spellStart"/>
       <w:r>
-        <w:t>Num_list</w:t>
+        <w:t>i</w:t>
       </w:r>
       <w:proofErr w:type="spellEnd"/>
       <w:r>
-        <w:t>[</w:t>
-      </w:r>
-      <w:proofErr w:type="spellStart"/>
-      <w:r>
-        <w:t>i</w:t>
-      </w:r>
-      <w:proofErr w:type="spellEnd"/>
-      <w:r>
-        <w:t xml:space="preserve">] + 4 = </w:t>
-      </w:r>
-      <w:proofErr w:type="spellStart"/>
-      <w:r>
-        <w:t>Num_list</w:t>
-      </w:r>
-      <w:proofErr w:type="spellEnd"/>
-      <w:r>
-        <w:t xml:space="preserve">[i+4], then check if </w:t>
+        <w:t xml:space="preserve">] + 4 = Num_list[i+4], then check if </w:t>
       </w:r>
       <w:proofErr w:type="spellStart"/>
       <w:r>
@@ -6568,7 +6544,6 @@
                 <w:szCs w:val="28"/>
               </w:rPr>
             </w:pPr>
-            <w:proofErr w:type="spellStart"/>
             <w:r>
               <w:rPr>
                 <w:sz w:val="28"/>
@@ -6576,7 +6551,6 @@
               </w:rPr>
               <w:t>Pair_num</w:t>
             </w:r>
-            <w:proofErr w:type="spellEnd"/>
           </w:p>
         </w:tc>
         <w:tc>
@@ -6625,7 +6599,6 @@
                 <w:szCs w:val="28"/>
               </w:rPr>
             </w:pPr>
-            <w:proofErr w:type="spellStart"/>
             <w:r>
               <w:rPr>
                 <w:sz w:val="28"/>
@@ -6633,7 +6606,6 @@
               </w:rPr>
               <w:t>Second_pair</w:t>
             </w:r>
-            <w:proofErr w:type="spellEnd"/>
           </w:p>
         </w:tc>
         <w:tc>
@@ -6662,21 +6634,8 @@
           </w:tcPr>
           <w:p>
             <w:r>
-              <w:t xml:space="preserve">Checks that this value is not </w:t>
-            </w:r>
-            <w:proofErr w:type="spellStart"/>
-            <w:r>
-              <w:t>Pair_num</w:t>
-            </w:r>
-            <w:proofErr w:type="spellEnd"/>
-            <w:r>
-              <w:t xml:space="preserve">, and is lower than </w:t>
-            </w:r>
-            <w:proofErr w:type="spellStart"/>
-            <w:r>
-              <w:t>Pair_num</w:t>
-            </w:r>
-            <w:proofErr w:type="spellEnd"/>
+              <w:t>Checks that this value is not Pair_num, and is lower than Pair_num</w:t>
+            </w:r>
             <w:r>
               <w:t>.</w:t>
             </w:r>
@@ -6736,15 +6695,7 @@
           </w:tcPr>
           <w:p>
             <w:r>
-              <w:t xml:space="preserve">Same as </w:t>
-            </w:r>
-            <w:proofErr w:type="spellStart"/>
-            <w:r>
-              <w:t>Pair_num</w:t>
-            </w:r>
-            <w:proofErr w:type="spellEnd"/>
-            <w:r>
-              <w:t xml:space="preserve"> but with Triples. Having the rank as a variable helps with displaying info to the players</w:t>
+              <w:t>Same as Pair_num but with Triples. Having the rank as a variable helps with displaying info to the players</w:t>
             </w:r>
             <w:r>
               <w:t>.</w:t>
@@ -6903,7 +6854,6 @@
                 <w:szCs w:val="28"/>
               </w:rPr>
             </w:pPr>
-            <w:proofErr w:type="spellStart"/>
             <w:r>
               <w:rPr>
                 <w:sz w:val="28"/>
@@ -6911,7 +6861,6 @@
               </w:rPr>
               <w:t>Num_list</w:t>
             </w:r>
-            <w:proofErr w:type="spellEnd"/>
           </w:p>
         </w:tc>
         <w:tc>
@@ -7137,7 +7086,6 @@
                 <w:szCs w:val="28"/>
               </w:rPr>
             </w:pPr>
-            <w:proofErr w:type="spellStart"/>
             <w:r>
               <w:rPr>
                 <w:sz w:val="28"/>
@@ -7146,7 +7094,6 @@
               <w:lastRenderedPageBreak/>
               <w:t>Temp_list</w:t>
             </w:r>
-            <w:proofErr w:type="spellEnd"/>
           </w:p>
         </w:tc>
         <w:tc>
@@ -7175,21 +7122,11 @@
           </w:tcPr>
           <w:p>
             <w:r>
-              <w:t xml:space="preserve">An edited version of </w:t>
-            </w:r>
-            <w:proofErr w:type="spellStart"/>
-            <w:r>
-              <w:t>Num_list</w:t>
-            </w:r>
-            <w:proofErr w:type="spellEnd"/>
-            <w:r>
-              <w:t xml:space="preserve">, used for deleting duplicates while not affecting </w:t>
-            </w:r>
-            <w:proofErr w:type="spellStart"/>
-            <w:r>
-              <w:t>Num_list</w:t>
-            </w:r>
-            <w:proofErr w:type="spellEnd"/>
+              <w:t>An edited version of Num_list</w:t>
+            </w:r>
+            <w:r>
+              <w:t>, used for deleting duplicates while not affecting Num_list</w:t>
+            </w:r>
             <w:r>
               <w:t>.</w:t>
             </w:r>
@@ -7416,7 +7353,7 @@
                     </pic:cNvPicPr>
                   </pic:nvPicPr>
                   <pic:blipFill>
-                    <a:blip r:embed="rId13" cstate="print">
+                    <a:blip r:embed="rId15" cstate="print">
                       <a:extLst>
                         <a:ext uri="{28A0092B-C50C-407E-A947-70E740481C1C}">
                           <a14:useLocalDpi xmlns:a14="http://schemas.microsoft.com/office/drawing/2010/main" val="0"/>
@@ -7619,6 +7556,7 @@
       </w:pPr>
       <w:r>
         <w:rPr>
+          <w:noProof/>
           <w:sz w:val="28"/>
           <w:szCs w:val="28"/>
         </w:rPr>
@@ -7638,7 +7576,7 @@
                     <pic:cNvPicPr/>
                   </pic:nvPicPr>
                   <pic:blipFill>
-                    <a:blip r:embed="rId14"/>
+                    <a:blip r:embed="rId16"/>
                     <a:stretch>
                       <a:fillRect/>
                     </a:stretch>
@@ -7668,6 +7606,7 @@
       </w:pPr>
       <w:r>
         <w:rPr>
+          <w:noProof/>
           <w:sz w:val="28"/>
           <w:szCs w:val="28"/>
         </w:rPr>
@@ -7687,7 +7626,7 @@
                     <pic:cNvPicPr/>
                   </pic:nvPicPr>
                   <pic:blipFill>
-                    <a:blip r:embed="rId15"/>
+                    <a:blip r:embed="rId17"/>
                     <a:stretch>
                       <a:fillRect/>
                     </a:stretch>
@@ -7717,6 +7656,7 @@
       </w:pPr>
       <w:r>
         <w:rPr>
+          <w:noProof/>
           <w:sz w:val="32"/>
           <w:szCs w:val="32"/>
         </w:rPr>
@@ -7737,7 +7677,7 @@
                     <pic:cNvPicPr/>
                   </pic:nvPicPr>
                   <pic:blipFill>
-                    <a:blip r:embed="rId16"/>
+                    <a:blip r:embed="rId18"/>
                     <a:stretch>
                       <a:fillRect/>
                     </a:stretch>
@@ -7843,6 +7783,7 @@
       </w:r>
       <w:r>
         <w:rPr>
+          <w:noProof/>
           <w:sz w:val="28"/>
           <w:szCs w:val="28"/>
         </w:rPr>
@@ -7862,7 +7803,7 @@
                     <pic:cNvPicPr/>
                   </pic:nvPicPr>
                   <pic:blipFill>
-                    <a:blip r:embed="rId17"/>
+                    <a:blip r:embed="rId19"/>
                     <a:stretch>
                       <a:fillRect/>
                     </a:stretch>
@@ -7904,6 +7845,2464 @@
     </w:p>
     <w:p>
       <w:pPr>
+        <w:ind w:left="720" w:hanging="720"/>
+        <w:rPr>
+          <w:sz w:val="28"/>
+          <w:szCs w:val="28"/>
+        </w:rPr>
+      </w:pPr>
+      <w:r>
+        <w:rPr>
+          <w:sz w:val="28"/>
+          <w:szCs w:val="28"/>
+        </w:rPr>
+        <w:lastRenderedPageBreak/>
+        <w:t>The first stage of simplification came with the function King_Maker.</w:t>
+      </w:r>
+    </w:p>
+    <w:p>
+      <w:pPr>
+        <w:ind w:left="720" w:hanging="720"/>
+        <w:rPr>
+          <w:sz w:val="28"/>
+          <w:szCs w:val="28"/>
+        </w:rPr>
+      </w:pPr>
+      <w:r>
+        <w:rPr>
+          <w:sz w:val="28"/>
+          <w:szCs w:val="28"/>
+        </w:rPr>
+        <w:t xml:space="preserve">This function takes the value of placeholder and changes it`s value if it is </w:t>
+      </w:r>
+    </w:p>
+    <w:p>
+      <w:pPr>
+        <w:ind w:left="720" w:hanging="720"/>
+        <w:rPr>
+          <w:sz w:val="28"/>
+          <w:szCs w:val="28"/>
+        </w:rPr>
+      </w:pPr>
+      <w:r>
+        <w:rPr>
+          <w:sz w:val="28"/>
+          <w:szCs w:val="28"/>
+        </w:rPr>
+        <w:t>one of the alternate names I.E. king is 13 and Jack is 11.</w:t>
+      </w:r>
+    </w:p>
+    <w:p>
+      <w:pPr>
+        <w:ind w:left="720" w:hanging="720"/>
+        <w:rPr>
+          <w:sz w:val="28"/>
+          <w:szCs w:val="28"/>
+        </w:rPr>
+      </w:pPr>
+      <w:r>
+        <w:rPr>
+          <w:sz w:val="28"/>
+          <w:szCs w:val="28"/>
+        </w:rPr>
+        <w:t xml:space="preserve">Having this as </w:t>
+      </w:r>
+      <w:r>
+        <w:rPr>
+          <w:sz w:val="28"/>
+          <w:szCs w:val="28"/>
+        </w:rPr>
+        <w:t>its</w:t>
+      </w:r>
+      <w:r>
+        <w:rPr>
+          <w:sz w:val="28"/>
+          <w:szCs w:val="28"/>
+        </w:rPr>
+        <w:t xml:space="preserve"> own function reduces redundancy and makes i</w:t>
+      </w:r>
+      <w:r>
+        <w:rPr>
+          <w:sz w:val="28"/>
+          <w:szCs w:val="28"/>
+        </w:rPr>
+        <w:t>t</w:t>
+      </w:r>
+    </w:p>
+    <w:p>
+      <w:pPr>
+        <w:ind w:left="720" w:hanging="720"/>
+        <w:rPr>
+          <w:sz w:val="28"/>
+          <w:szCs w:val="28"/>
+        </w:rPr>
+      </w:pPr>
+      <w:r>
+        <w:rPr>
+          <w:sz w:val="28"/>
+          <w:szCs w:val="28"/>
+        </w:rPr>
+        <w:t>M</w:t>
+      </w:r>
+      <w:r>
+        <w:rPr>
+          <w:sz w:val="28"/>
+          <w:szCs w:val="28"/>
+        </w:rPr>
+        <w:t>or</w:t>
+      </w:r>
+      <w:r>
+        <w:rPr>
+          <w:sz w:val="28"/>
+          <w:szCs w:val="28"/>
+        </w:rPr>
+        <w:t xml:space="preserve">e re-usable for later in the program, hence why placeholder is used and </w:t>
+      </w:r>
+    </w:p>
+    <w:p>
+      <w:pPr>
+        <w:ind w:left="720" w:hanging="720"/>
+        <w:rPr>
+          <w:sz w:val="28"/>
+          <w:szCs w:val="28"/>
+        </w:rPr>
+      </w:pPr>
+      <w:r>
+        <w:rPr>
+          <w:sz w:val="28"/>
+          <w:szCs w:val="28"/>
+        </w:rPr>
+        <w:t xml:space="preserve">not for example </w:t>
+      </w:r>
+      <w:proofErr w:type="spellStart"/>
+      <w:r>
+        <w:rPr>
+          <w:sz w:val="28"/>
+          <w:szCs w:val="28"/>
+        </w:rPr>
+        <w:t>Number_option</w:t>
+      </w:r>
+      <w:proofErr w:type="spellEnd"/>
+      <w:r>
+        <w:rPr>
+          <w:sz w:val="28"/>
+          <w:szCs w:val="28"/>
+        </w:rPr>
+        <w:t>.</w:t>
+      </w:r>
+    </w:p>
+    <w:p>
+      <w:pPr>
+        <w:ind w:left="720" w:hanging="720"/>
+        <w:rPr>
+          <w:sz w:val="28"/>
+          <w:szCs w:val="28"/>
+        </w:rPr>
+      </w:pPr>
+      <w:r>
+        <w:rPr>
+          <w:sz w:val="28"/>
+          <w:szCs w:val="28"/>
+        </w:rPr>
+        <w:drawing>
+          <wp:inline distT="0" distB="0" distL="0" distR="0" wp14:anchorId="718988B5" wp14:editId="15363529">
+            <wp:extent cx="5731510" cy="1518920"/>
+            <wp:effectExtent l="0" t="0" r="2540" b="5080"/>
+            <wp:docPr id="1757196859" name="Picture 1"/>
+            <wp:cNvGraphicFramePr>
+              <a:graphicFrameLocks xmlns:a="http://schemas.openxmlformats.org/drawingml/2006/main" noChangeAspect="1"/>
+            </wp:cNvGraphicFramePr>
+            <a:graphic xmlns:a="http://schemas.openxmlformats.org/drawingml/2006/main">
+              <a:graphicData uri="http://schemas.openxmlformats.org/drawingml/2006/picture">
+                <pic:pic xmlns:pic="http://schemas.openxmlformats.org/drawingml/2006/picture">
+                  <pic:nvPicPr>
+                    <pic:cNvPr id="1757196859" name=""/>
+                    <pic:cNvPicPr/>
+                  </pic:nvPicPr>
+                  <pic:blipFill>
+                    <a:blip r:embed="rId20"/>
+                    <a:stretch>
+                      <a:fillRect/>
+                    </a:stretch>
+                  </pic:blipFill>
+                  <pic:spPr>
+                    <a:xfrm>
+                      <a:off x="0" y="0"/>
+                      <a:ext cx="5731510" cy="1518920"/>
+                    </a:xfrm>
+                    <a:prstGeom prst="rect">
+                      <a:avLst/>
+                    </a:prstGeom>
+                  </pic:spPr>
+                </pic:pic>
+              </a:graphicData>
+            </a:graphic>
+          </wp:inline>
+        </w:drawing>
+      </w:r>
+    </w:p>
+    <w:p>
+      <w:pPr>
+        <w:rPr>
+          <w:sz w:val="28"/>
+          <w:szCs w:val="28"/>
+        </w:rPr>
+      </w:pPr>
+      <w:r>
+        <w:rPr>
+          <w:sz w:val="28"/>
+          <w:szCs w:val="28"/>
+        </w:rPr>
+        <w:t xml:space="preserve">Afterwards, the next step was choosing to generate all the necessary cards at the start of the program and storing them in a list, rather than having 7 variables and overwriting them. The first stage of that was getting the </w:t>
+      </w:r>
+      <w:r>
+        <w:rPr>
+          <w:sz w:val="28"/>
+          <w:szCs w:val="28"/>
+        </w:rPr>
+        <w:t>number</w:t>
+      </w:r>
+      <w:r>
+        <w:rPr>
+          <w:sz w:val="28"/>
+          <w:szCs w:val="28"/>
+        </w:rPr>
+        <w:t xml:space="preserve"> of computers immediately.</w:t>
+      </w:r>
+    </w:p>
+    <w:p>
+      <w:pPr>
+        <w:rPr>
+          <w:sz w:val="28"/>
+          <w:szCs w:val="28"/>
+        </w:rPr>
+      </w:pPr>
+      <w:r>
+        <w:rPr>
+          <w:sz w:val="28"/>
+          <w:szCs w:val="28"/>
+        </w:rPr>
+        <w:drawing>
+          <wp:inline distT="0" distB="0" distL="0" distR="0" wp14:anchorId="375E337B" wp14:editId="33E9B440">
+            <wp:extent cx="5105842" cy="723963"/>
+            <wp:effectExtent l="0" t="0" r="0" b="0"/>
+            <wp:docPr id="585282676" name="Picture 1"/>
+            <wp:cNvGraphicFramePr>
+              <a:graphicFrameLocks xmlns:a="http://schemas.openxmlformats.org/drawingml/2006/main" noChangeAspect="1"/>
+            </wp:cNvGraphicFramePr>
+            <a:graphic xmlns:a="http://schemas.openxmlformats.org/drawingml/2006/main">
+              <a:graphicData uri="http://schemas.openxmlformats.org/drawingml/2006/picture">
+                <pic:pic xmlns:pic="http://schemas.openxmlformats.org/drawingml/2006/picture">
+                  <pic:nvPicPr>
+                    <pic:cNvPr id="585282676" name=""/>
+                    <pic:cNvPicPr/>
+                  </pic:nvPicPr>
+                  <pic:blipFill>
+                    <a:blip r:embed="rId21"/>
+                    <a:stretch>
+                      <a:fillRect/>
+                    </a:stretch>
+                  </pic:blipFill>
+                  <pic:spPr>
+                    <a:xfrm>
+                      <a:off x="0" y="0"/>
+                      <a:ext cx="5105842" cy="723963"/>
+                    </a:xfrm>
+                    <a:prstGeom prst="rect">
+                      <a:avLst/>
+                    </a:prstGeom>
+                  </pic:spPr>
+                </pic:pic>
+              </a:graphicData>
+            </a:graphic>
+          </wp:inline>
+        </w:drawing>
+      </w:r>
+    </w:p>
+    <w:p>
+      <w:pPr>
+        <w:rPr>
+          <w:sz w:val="28"/>
+          <w:szCs w:val="28"/>
+        </w:rPr>
+      </w:pPr>
+      <w:r>
+        <w:rPr>
+          <w:sz w:val="28"/>
+          <w:szCs w:val="28"/>
+        </w:rPr>
+        <w:t xml:space="preserve">Then, the function </w:t>
+      </w:r>
+      <w:proofErr w:type="spellStart"/>
+      <w:r>
+        <w:rPr>
+          <w:sz w:val="28"/>
+          <w:szCs w:val="28"/>
+        </w:rPr>
+        <w:t>Cards_Test</w:t>
+      </w:r>
+      <w:proofErr w:type="spellEnd"/>
+      <w:r>
+        <w:rPr>
+          <w:sz w:val="28"/>
+          <w:szCs w:val="28"/>
+        </w:rPr>
+        <w:t xml:space="preserve"> runs recursively, generating 2 * the </w:t>
+      </w:r>
+      <w:proofErr w:type="gramStart"/>
+      <w:r>
+        <w:rPr>
+          <w:sz w:val="28"/>
+          <w:szCs w:val="28"/>
+        </w:rPr>
+        <w:t>amount</w:t>
+      </w:r>
+      <w:proofErr w:type="gramEnd"/>
+      <w:r>
+        <w:rPr>
+          <w:sz w:val="28"/>
+          <w:szCs w:val="28"/>
+        </w:rPr>
+        <w:t xml:space="preserve"> of computers, an extra 2 for the players and 5 for the universal cards</w:t>
+      </w:r>
+    </w:p>
+    <w:p>
+      <w:pPr>
+        <w:rPr>
+          <w:sz w:val="28"/>
+          <w:szCs w:val="28"/>
+        </w:rPr>
+      </w:pPr>
+      <w:r>
+        <w:rPr>
+          <w:sz w:val="28"/>
+          <w:szCs w:val="28"/>
+        </w:rPr>
+        <w:drawing>
+          <wp:inline distT="0" distB="0" distL="0" distR="0" wp14:anchorId="09E4AA4C" wp14:editId="2465EED1">
+            <wp:extent cx="3375953" cy="434378"/>
+            <wp:effectExtent l="0" t="0" r="0" b="3810"/>
+            <wp:docPr id="44335239" name="Picture 1"/>
+            <wp:cNvGraphicFramePr>
+              <a:graphicFrameLocks xmlns:a="http://schemas.openxmlformats.org/drawingml/2006/main" noChangeAspect="1"/>
+            </wp:cNvGraphicFramePr>
+            <a:graphic xmlns:a="http://schemas.openxmlformats.org/drawingml/2006/main">
+              <a:graphicData uri="http://schemas.openxmlformats.org/drawingml/2006/picture">
+                <pic:pic xmlns:pic="http://schemas.openxmlformats.org/drawingml/2006/picture">
+                  <pic:nvPicPr>
+                    <pic:cNvPr id="44335239" name=""/>
+                    <pic:cNvPicPr/>
+                  </pic:nvPicPr>
+                  <pic:blipFill>
+                    <a:blip r:embed="rId22"/>
+                    <a:stretch>
+                      <a:fillRect/>
+                    </a:stretch>
+                  </pic:blipFill>
+                  <pic:spPr>
+                    <a:xfrm>
+                      <a:off x="0" y="0"/>
+                      <a:ext cx="3375953" cy="434378"/>
+                    </a:xfrm>
+                    <a:prstGeom prst="rect">
+                      <a:avLst/>
+                    </a:prstGeom>
+                  </pic:spPr>
+                </pic:pic>
+              </a:graphicData>
+            </a:graphic>
+          </wp:inline>
+        </w:drawing>
+      </w:r>
+    </w:p>
+    <w:p>
+      <w:pPr>
+        <w:rPr>
+          <w:sz w:val="28"/>
+          <w:szCs w:val="28"/>
+        </w:rPr>
+      </w:pPr>
+      <w:proofErr w:type="spellStart"/>
+      <w:r>
+        <w:rPr>
+          <w:sz w:val="28"/>
+          <w:szCs w:val="28"/>
+        </w:rPr>
+        <w:t>Cards_Test</w:t>
+      </w:r>
+      <w:proofErr w:type="spellEnd"/>
+      <w:r>
+        <w:rPr>
+          <w:sz w:val="28"/>
+          <w:szCs w:val="28"/>
+        </w:rPr>
+        <w:t xml:space="preserve"> then runs the same process as the </w:t>
+      </w:r>
+      <w:proofErr w:type="spellStart"/>
+      <w:r>
+        <w:rPr>
+          <w:sz w:val="28"/>
+          <w:szCs w:val="28"/>
+        </w:rPr>
+        <w:t>inneficient</w:t>
+      </w:r>
+      <w:proofErr w:type="spellEnd"/>
+      <w:r>
+        <w:rPr>
+          <w:sz w:val="28"/>
+          <w:szCs w:val="28"/>
+        </w:rPr>
+        <w:t xml:space="preserve"> method, except now appending it`s values to lists instead of unique variables, making it much more </w:t>
+      </w:r>
+      <w:r>
+        <w:rPr>
+          <w:sz w:val="28"/>
+          <w:szCs w:val="28"/>
+        </w:rPr>
+        <w:t>efficient with recursion, and</w:t>
+      </w:r>
+      <w:r>
+        <w:rPr>
+          <w:sz w:val="28"/>
+          <w:szCs w:val="28"/>
+        </w:rPr>
+        <w:t xml:space="preserve"> easier to find values by indexing the list.</w:t>
+      </w:r>
+    </w:p>
+    <w:p>
+      <w:pPr>
+        <w:rPr>
+          <w:sz w:val="28"/>
+          <w:szCs w:val="28"/>
+        </w:rPr>
+      </w:pPr>
+      <w:r>
+        <w:rPr>
+          <w:sz w:val="28"/>
+          <w:szCs w:val="28"/>
+        </w:rPr>
+        <w:t xml:space="preserve">(The function is called </w:t>
+      </w:r>
+      <w:proofErr w:type="spellStart"/>
+      <w:r>
+        <w:rPr>
+          <w:sz w:val="28"/>
+          <w:szCs w:val="28"/>
+        </w:rPr>
+        <w:t>Cards_Test</w:t>
+      </w:r>
+      <w:proofErr w:type="spellEnd"/>
+      <w:r>
+        <w:rPr>
+          <w:sz w:val="28"/>
+          <w:szCs w:val="28"/>
+        </w:rPr>
+        <w:t xml:space="preserve"> as it was initially a function ran each time a card was made, to verify the card is unique. This </w:t>
+      </w:r>
+      <w:proofErr w:type="gramStart"/>
+      <w:r>
+        <w:rPr>
+          <w:sz w:val="28"/>
+          <w:szCs w:val="28"/>
+        </w:rPr>
+        <w:t>pretty quickly</w:t>
+      </w:r>
+      <w:proofErr w:type="gramEnd"/>
+      <w:r>
+        <w:rPr>
+          <w:sz w:val="28"/>
+          <w:szCs w:val="28"/>
+        </w:rPr>
+        <w:t xml:space="preserve"> came where the cards were generated)</w:t>
+      </w:r>
+    </w:p>
+    <w:p>
+      <w:pPr>
+        <w:rPr>
+          <w:sz w:val="28"/>
+          <w:szCs w:val="28"/>
+        </w:rPr>
+      </w:pPr>
+      <w:r>
+        <w:rPr>
+          <w:sz w:val="28"/>
+          <w:szCs w:val="28"/>
+        </w:rPr>
+        <w:lastRenderedPageBreak/>
+        <w:drawing>
+          <wp:inline distT="0" distB="0" distL="0" distR="0" wp14:anchorId="330A2D63" wp14:editId="21D6C995">
+            <wp:extent cx="5731510" cy="2163445"/>
+            <wp:effectExtent l="0" t="0" r="2540" b="8255"/>
+            <wp:docPr id="1182184793" name="Picture 1"/>
+            <wp:cNvGraphicFramePr>
+              <a:graphicFrameLocks xmlns:a="http://schemas.openxmlformats.org/drawingml/2006/main" noChangeAspect="1"/>
+            </wp:cNvGraphicFramePr>
+            <a:graphic xmlns:a="http://schemas.openxmlformats.org/drawingml/2006/main">
+              <a:graphicData uri="http://schemas.openxmlformats.org/drawingml/2006/picture">
+                <pic:pic xmlns:pic="http://schemas.openxmlformats.org/drawingml/2006/picture">
+                  <pic:nvPicPr>
+                    <pic:cNvPr id="1182184793" name=""/>
+                    <pic:cNvPicPr/>
+                  </pic:nvPicPr>
+                  <pic:blipFill>
+                    <a:blip r:embed="rId23"/>
+                    <a:stretch>
+                      <a:fillRect/>
+                    </a:stretch>
+                  </pic:blipFill>
+                  <pic:spPr>
+                    <a:xfrm>
+                      <a:off x="0" y="0"/>
+                      <a:ext cx="5731510" cy="2163445"/>
+                    </a:xfrm>
+                    <a:prstGeom prst="rect">
+                      <a:avLst/>
+                    </a:prstGeom>
+                  </pic:spPr>
+                </pic:pic>
+              </a:graphicData>
+            </a:graphic>
+          </wp:inline>
+        </w:drawing>
+      </w:r>
+    </w:p>
+    <w:p>
+      <w:pPr>
+        <w:rPr>
+          <w:sz w:val="28"/>
+          <w:szCs w:val="28"/>
+        </w:rPr>
+      </w:pPr>
+    </w:p>
+    <w:p>
+      <w:pPr>
+        <w:rPr>
+          <w:sz w:val="28"/>
+          <w:szCs w:val="28"/>
+        </w:rPr>
+      </w:pPr>
+      <w:r>
+        <w:rPr>
+          <w:sz w:val="28"/>
+          <w:szCs w:val="28"/>
+        </w:rPr>
+        <w:t xml:space="preserve">After Card generation, the next objective was to take the 7 cards each player would have access to at the end and give them a score if they were a hand in poker, following the same system as how poker hands are normally evaluated. This is easily the biggest function in the program as each hand type must be written, as well as the computer side of things that integrated itself into the function, and the higher complexity requiring more notes inside this function. Even at the end when the displayment was moved to </w:t>
+      </w:r>
+      <w:r>
+        <w:rPr>
+          <w:sz w:val="28"/>
+          <w:szCs w:val="28"/>
+        </w:rPr>
+        <w:t>another function, it is still well over 100 lines longer than the next biggest function.</w:t>
+      </w:r>
+    </w:p>
+    <w:p>
+      <w:pPr>
+        <w:rPr>
+          <w:sz w:val="28"/>
+          <w:szCs w:val="28"/>
+        </w:rPr>
+      </w:pPr>
+    </w:p>
+    <w:p>
+      <w:pPr>
+        <w:rPr>
+          <w:sz w:val="28"/>
+          <w:szCs w:val="28"/>
+        </w:rPr>
+      </w:pPr>
+      <w:r>
+        <w:rPr>
+          <w:sz w:val="28"/>
+          <w:szCs w:val="28"/>
+        </w:rPr>
+        <w:t>I first began by going hand by hand, assuming the player`s cards were the only group of cards that mattered. I made a list of all numbers and suits separately, as well as unsorted versions which was necessary for straight flushes.</w:t>
+      </w:r>
+    </w:p>
+    <w:p>
+      <w:pPr>
+        <w:rPr>
+          <w:sz w:val="28"/>
+          <w:szCs w:val="28"/>
+        </w:rPr>
+      </w:pPr>
+      <w:r>
+        <w:rPr>
+          <w:sz w:val="28"/>
+          <w:szCs w:val="28"/>
+        </w:rPr>
+        <w:drawing>
+          <wp:inline distT="0" distB="0" distL="0" distR="0" wp14:anchorId="21488067" wp14:editId="7613F71A">
+            <wp:extent cx="5731510" cy="880110"/>
+            <wp:effectExtent l="0" t="0" r="2540" b="0"/>
+            <wp:docPr id="66226200" name="Picture 1"/>
+            <wp:cNvGraphicFramePr>
+              <a:graphicFrameLocks xmlns:a="http://schemas.openxmlformats.org/drawingml/2006/main" noChangeAspect="1"/>
+            </wp:cNvGraphicFramePr>
+            <a:graphic xmlns:a="http://schemas.openxmlformats.org/drawingml/2006/main">
+              <a:graphicData uri="http://schemas.openxmlformats.org/drawingml/2006/picture">
+                <pic:pic xmlns:pic="http://schemas.openxmlformats.org/drawingml/2006/picture">
+                  <pic:nvPicPr>
+                    <pic:cNvPr id="66226200" name=""/>
+                    <pic:cNvPicPr/>
+                  </pic:nvPicPr>
+                  <pic:blipFill>
+                    <a:blip r:embed="rId24"/>
+                    <a:stretch>
+                      <a:fillRect/>
+                    </a:stretch>
+                  </pic:blipFill>
+                  <pic:spPr>
+                    <a:xfrm>
+                      <a:off x="0" y="0"/>
+                      <a:ext cx="5731510" cy="880110"/>
+                    </a:xfrm>
+                    <a:prstGeom prst="rect">
+                      <a:avLst/>
+                    </a:prstGeom>
+                  </pic:spPr>
+                </pic:pic>
+              </a:graphicData>
+            </a:graphic>
+          </wp:inline>
+        </w:drawing>
+      </w:r>
+    </w:p>
+    <w:p>
+      <w:pPr>
+        <w:rPr>
+          <w:sz w:val="28"/>
+          <w:szCs w:val="28"/>
+        </w:rPr>
+      </w:pPr>
+      <w:r>
+        <w:rPr>
+          <w:sz w:val="28"/>
+          <w:szCs w:val="28"/>
+        </w:rPr>
+        <w:t xml:space="preserve">The code would run each transaction every </w:t>
+      </w:r>
+      <w:proofErr w:type="gramStart"/>
+      <w:r>
+        <w:rPr>
+          <w:sz w:val="28"/>
+          <w:szCs w:val="28"/>
+        </w:rPr>
+        <w:t>loop, and</w:t>
+      </w:r>
+      <w:proofErr w:type="gramEnd"/>
+      <w:r>
+        <w:rPr>
+          <w:sz w:val="28"/>
+          <w:szCs w:val="28"/>
+        </w:rPr>
+        <w:t xml:space="preserve"> would update the score with a higher value if the condition was met, so if a player had both a pair and a 4 of kind, I could guarantee only the highest hand would be considered their hand.</w:t>
+      </w:r>
+    </w:p>
+    <w:p>
+      <w:pPr>
+        <w:rPr>
+          <w:sz w:val="28"/>
+          <w:szCs w:val="28"/>
+        </w:rPr>
+      </w:pPr>
+      <w:r>
+        <w:rPr>
+          <w:sz w:val="28"/>
+          <w:szCs w:val="28"/>
+        </w:rPr>
+        <w:t>The scores read as followed:</w:t>
+      </w:r>
+    </w:p>
+    <w:p>
+      <w:pPr>
+        <w:rPr>
+          <w:sz w:val="28"/>
+          <w:szCs w:val="28"/>
+        </w:rPr>
+      </w:pPr>
+      <w:r>
+        <w:rPr>
+          <w:sz w:val="28"/>
+          <w:szCs w:val="28"/>
+        </w:rPr>
+        <w:lastRenderedPageBreak/>
+        <w:t>High card - 0</w:t>
+      </w:r>
+    </w:p>
+    <w:p>
+      <w:pPr>
+        <w:rPr>
+          <w:sz w:val="28"/>
+          <w:szCs w:val="28"/>
+        </w:rPr>
+      </w:pPr>
+      <w:r>
+        <w:rPr>
+          <w:sz w:val="28"/>
+          <w:szCs w:val="28"/>
+        </w:rPr>
+        <w:t xml:space="preserve">Pair – 2 </w:t>
+      </w:r>
+    </w:p>
+    <w:p>
+      <w:pPr>
+        <w:rPr>
+          <w:sz w:val="28"/>
+          <w:szCs w:val="28"/>
+        </w:rPr>
+      </w:pPr>
+      <w:r>
+        <w:rPr>
+          <w:sz w:val="28"/>
+          <w:szCs w:val="28"/>
+        </w:rPr>
+        <w:t>Two pair – 3</w:t>
+      </w:r>
+    </w:p>
+    <w:p>
+      <w:pPr>
+        <w:rPr>
+          <w:sz w:val="28"/>
+          <w:szCs w:val="28"/>
+        </w:rPr>
+      </w:pPr>
+      <w:r>
+        <w:rPr>
+          <w:sz w:val="28"/>
+          <w:szCs w:val="28"/>
+        </w:rPr>
+        <w:t>Three of a kind – 4</w:t>
+      </w:r>
+    </w:p>
+    <w:p>
+      <w:pPr>
+        <w:rPr>
+          <w:sz w:val="28"/>
+          <w:szCs w:val="28"/>
+        </w:rPr>
+      </w:pPr>
+      <w:r>
+        <w:rPr>
+          <w:sz w:val="28"/>
+          <w:szCs w:val="28"/>
+        </w:rPr>
+        <w:t>Straight – 5</w:t>
+      </w:r>
+    </w:p>
+    <w:p>
+      <w:pPr>
+        <w:rPr>
+          <w:sz w:val="28"/>
+          <w:szCs w:val="28"/>
+        </w:rPr>
+      </w:pPr>
+      <w:r>
+        <w:rPr>
+          <w:sz w:val="28"/>
+          <w:szCs w:val="28"/>
+        </w:rPr>
+        <w:t>Flush – 6</w:t>
+      </w:r>
+    </w:p>
+    <w:p>
+      <w:pPr>
+        <w:rPr>
+          <w:sz w:val="28"/>
+          <w:szCs w:val="28"/>
+        </w:rPr>
+      </w:pPr>
+      <w:r>
+        <w:rPr>
+          <w:sz w:val="28"/>
+          <w:szCs w:val="28"/>
+        </w:rPr>
+        <w:t>Full house – 7</w:t>
+      </w:r>
+    </w:p>
+    <w:p>
+      <w:pPr>
+        <w:rPr>
+          <w:sz w:val="28"/>
+          <w:szCs w:val="28"/>
+        </w:rPr>
+      </w:pPr>
+      <w:r>
+        <w:rPr>
+          <w:sz w:val="28"/>
+          <w:szCs w:val="28"/>
+        </w:rPr>
+        <w:t>Four of a kind – 8</w:t>
+      </w:r>
+    </w:p>
+    <w:p>
+      <w:pPr>
+        <w:rPr>
+          <w:sz w:val="28"/>
+          <w:szCs w:val="28"/>
+        </w:rPr>
+      </w:pPr>
+      <w:r>
+        <w:rPr>
+          <w:sz w:val="28"/>
+          <w:szCs w:val="28"/>
+        </w:rPr>
+        <w:t>Straight flush – 9</w:t>
+      </w:r>
+    </w:p>
+    <w:p>
+      <w:pPr>
+        <w:rPr>
+          <w:sz w:val="28"/>
+          <w:szCs w:val="28"/>
+        </w:rPr>
+      </w:pPr>
+      <w:r>
+        <w:rPr>
+          <w:sz w:val="28"/>
+          <w:szCs w:val="28"/>
+        </w:rPr>
+        <w:t>Royal flush – 10</w:t>
+      </w:r>
+    </w:p>
+    <w:p>
+      <w:pPr>
+        <w:rPr>
+          <w:sz w:val="28"/>
+          <w:szCs w:val="28"/>
+        </w:rPr>
+      </w:pPr>
+    </w:p>
+    <w:p>
+      <w:pPr>
+        <w:rPr>
+          <w:sz w:val="28"/>
+          <w:szCs w:val="28"/>
+        </w:rPr>
+      </w:pPr>
+      <w:r>
+        <w:rPr>
+          <w:sz w:val="28"/>
+          <w:szCs w:val="28"/>
+        </w:rPr>
+        <w:t xml:space="preserve">For pairs, three of a kind and 4 of a kind, I went through the list of numbers, and check if the number ahead of them was the same. Since these numbers are ordered, if the number ahead of a number in the list was the same, </w:t>
+      </w:r>
+      <w:proofErr w:type="gramStart"/>
+      <w:r>
+        <w:rPr>
+          <w:sz w:val="28"/>
+          <w:szCs w:val="28"/>
+        </w:rPr>
+        <w:t>It</w:t>
+      </w:r>
+      <w:proofErr w:type="gramEnd"/>
+      <w:r>
+        <w:rPr>
+          <w:sz w:val="28"/>
+          <w:szCs w:val="28"/>
+        </w:rPr>
+        <w:t xml:space="preserve"> would mean there are 2 of that number in the list. This process is used for Pairs, 3OAK and 4OAK, with slightly different parameters and a different score</w:t>
+      </w:r>
+    </w:p>
+    <w:p>
+      <w:pPr>
+        <w:rPr>
+          <w:sz w:val="28"/>
+          <w:szCs w:val="28"/>
+        </w:rPr>
+      </w:pPr>
+      <w:r>
+        <w:rPr>
+          <w:sz w:val="28"/>
+          <w:szCs w:val="28"/>
+        </w:rPr>
+        <w:drawing>
+          <wp:inline distT="0" distB="0" distL="0" distR="0" wp14:anchorId="693F51EF" wp14:editId="3D3721B4">
+            <wp:extent cx="2842506" cy="571550"/>
+            <wp:effectExtent l="0" t="0" r="0" b="0"/>
+            <wp:docPr id="721448581" name="Picture 1"/>
+            <wp:cNvGraphicFramePr>
+              <a:graphicFrameLocks xmlns:a="http://schemas.openxmlformats.org/drawingml/2006/main" noChangeAspect="1"/>
+            </wp:cNvGraphicFramePr>
+            <a:graphic xmlns:a="http://schemas.openxmlformats.org/drawingml/2006/main">
+              <a:graphicData uri="http://schemas.openxmlformats.org/drawingml/2006/picture">
+                <pic:pic xmlns:pic="http://schemas.openxmlformats.org/drawingml/2006/picture">
+                  <pic:nvPicPr>
+                    <pic:cNvPr id="721448581" name=""/>
+                    <pic:cNvPicPr/>
+                  </pic:nvPicPr>
+                  <pic:blipFill>
+                    <a:blip r:embed="rId25"/>
+                    <a:stretch>
+                      <a:fillRect/>
+                    </a:stretch>
+                  </pic:blipFill>
+                  <pic:spPr>
+                    <a:xfrm>
+                      <a:off x="0" y="0"/>
+                      <a:ext cx="2842506" cy="571550"/>
+                    </a:xfrm>
+                    <a:prstGeom prst="rect">
+                      <a:avLst/>
+                    </a:prstGeom>
+                  </pic:spPr>
+                </pic:pic>
+              </a:graphicData>
+            </a:graphic>
+          </wp:inline>
+        </w:drawing>
+      </w:r>
+    </w:p>
+    <w:p>
+      <w:pPr>
+        <w:rPr>
+          <w:sz w:val="28"/>
+          <w:szCs w:val="28"/>
+        </w:rPr>
+      </w:pPr>
+      <w:r>
+        <w:rPr>
+          <w:sz w:val="28"/>
+          <w:szCs w:val="28"/>
+        </w:rPr>
+        <w:t>I then went straight to flushes, as they seemed easier to implement than two pair. For this transaction, I made a 5 long list, and checked if the start of the list was the same as the end of the list, as that would mean 5 values in a row would be the same suit, meaning there was a flush</w:t>
+      </w:r>
+    </w:p>
+    <w:p>
+      <w:pPr>
+        <w:rPr>
+          <w:sz w:val="28"/>
+          <w:szCs w:val="28"/>
+        </w:rPr>
+      </w:pPr>
+      <w:r>
+        <w:rPr>
+          <w:sz w:val="28"/>
+          <w:szCs w:val="28"/>
+        </w:rPr>
+        <w:drawing>
+          <wp:inline distT="0" distB="0" distL="0" distR="0" wp14:anchorId="53AF1933" wp14:editId="5B91F101">
+            <wp:extent cx="2346960" cy="1372750"/>
+            <wp:effectExtent l="0" t="0" r="0" b="0"/>
+            <wp:docPr id="692934695" name="Picture 1"/>
+            <wp:cNvGraphicFramePr>
+              <a:graphicFrameLocks xmlns:a="http://schemas.openxmlformats.org/drawingml/2006/main" noChangeAspect="1"/>
+            </wp:cNvGraphicFramePr>
+            <a:graphic xmlns:a="http://schemas.openxmlformats.org/drawingml/2006/main">
+              <a:graphicData uri="http://schemas.openxmlformats.org/drawingml/2006/picture">
+                <pic:pic xmlns:pic="http://schemas.openxmlformats.org/drawingml/2006/picture">
+                  <pic:nvPicPr>
+                    <pic:cNvPr id="692934695" name=""/>
+                    <pic:cNvPicPr/>
+                  </pic:nvPicPr>
+                  <pic:blipFill>
+                    <a:blip r:embed="rId26"/>
+                    <a:stretch>
+                      <a:fillRect/>
+                    </a:stretch>
+                  </pic:blipFill>
+                  <pic:spPr>
+                    <a:xfrm>
+                      <a:off x="0" y="0"/>
+                      <a:ext cx="2350654" cy="1374911"/>
+                    </a:xfrm>
+                    <a:prstGeom prst="rect">
+                      <a:avLst/>
+                    </a:prstGeom>
+                  </pic:spPr>
+                </pic:pic>
+              </a:graphicData>
+            </a:graphic>
+          </wp:inline>
+        </w:drawing>
+      </w:r>
+    </w:p>
+    <w:p>
+      <w:pPr>
+        <w:rPr>
+          <w:sz w:val="28"/>
+          <w:szCs w:val="28"/>
+        </w:rPr>
+      </w:pPr>
+      <w:r>
+        <w:rPr>
+          <w:sz w:val="28"/>
+          <w:szCs w:val="28"/>
+        </w:rPr>
+        <w:lastRenderedPageBreak/>
+        <w:t xml:space="preserve">Moving onto straights, I made a temporary list that had the duplicate numbers removed from it, as the duplicate numbers made evaluating a straight properly near impossible. In this temporary list I made it so an </w:t>
+      </w:r>
+      <w:proofErr w:type="gramStart"/>
+      <w:r>
+        <w:rPr>
+          <w:sz w:val="28"/>
+          <w:szCs w:val="28"/>
+        </w:rPr>
+        <w:t>ace acts</w:t>
+      </w:r>
+      <w:proofErr w:type="gramEnd"/>
+      <w:r>
+        <w:rPr>
+          <w:sz w:val="28"/>
+          <w:szCs w:val="28"/>
+        </w:rPr>
+        <w:t xml:space="preserve"> like both a 1 and a 14, being true how to how it functions in poker while stopping the illegal straight loops [12, 13, 1, 2 ,3] from being counted as straights. Then I check if the value of a value is 4 less than a value 4 ahead in the list, as without duplicates that means all those 5 numbers are consecutive, giving an accurate straight</w:t>
+      </w:r>
+    </w:p>
+    <w:p>
+      <w:pPr>
+        <w:rPr>
+          <w:sz w:val="28"/>
+          <w:szCs w:val="28"/>
+        </w:rPr>
+      </w:pPr>
+      <w:proofErr w:type="gramStart"/>
+      <w:r>
+        <w:rPr>
+          <w:sz w:val="28"/>
+          <w:szCs w:val="28"/>
+        </w:rPr>
+        <w:t>Also</w:t>
+      </w:r>
+      <w:proofErr w:type="gramEnd"/>
+      <w:r>
+        <w:rPr>
+          <w:sz w:val="28"/>
+          <w:szCs w:val="28"/>
+        </w:rPr>
+        <w:t xml:space="preserve"> Num is brought into this transaction because for some reason python just breaks with Temp_list[</w:t>
+      </w:r>
+      <w:proofErr w:type="spellStart"/>
+      <w:r>
+        <w:rPr>
+          <w:sz w:val="28"/>
+          <w:szCs w:val="28"/>
+        </w:rPr>
+        <w:t>i</w:t>
+      </w:r>
+      <w:proofErr w:type="spellEnd"/>
+      <w:r>
+        <w:rPr>
+          <w:sz w:val="28"/>
+          <w:szCs w:val="28"/>
+        </w:rPr>
+        <w:t>] + 4 = Temp_list[i+4</w:t>
+      </w:r>
+      <w:proofErr w:type="gramStart"/>
+      <w:r>
+        <w:rPr>
+          <w:sz w:val="28"/>
+          <w:szCs w:val="28"/>
+        </w:rPr>
+        <w:t>]</w:t>
+      </w:r>
+      <w:r>
+        <w:rPr>
+          <w:sz w:val="28"/>
+          <w:szCs w:val="28"/>
+        </w:rPr>
+        <w:t>, but</w:t>
+      </w:r>
+      <w:proofErr w:type="gramEnd"/>
+      <w:r>
+        <w:rPr>
+          <w:sz w:val="28"/>
+          <w:szCs w:val="28"/>
+        </w:rPr>
+        <w:t xml:space="preserve"> does work when Temp_list[</w:t>
+      </w:r>
+      <w:proofErr w:type="spellStart"/>
+      <w:r>
+        <w:rPr>
+          <w:sz w:val="28"/>
+          <w:szCs w:val="28"/>
+        </w:rPr>
+        <w:t>i</w:t>
+      </w:r>
+      <w:proofErr w:type="spellEnd"/>
+      <w:r>
+        <w:rPr>
+          <w:sz w:val="28"/>
+          <w:szCs w:val="28"/>
+        </w:rPr>
+        <w:t>] is it`s own variable.</w:t>
+      </w:r>
+    </w:p>
+    <w:p>
+      <w:pPr>
+        <w:rPr>
+          <w:sz w:val="28"/>
+          <w:szCs w:val="28"/>
+        </w:rPr>
+      </w:pPr>
+      <w:r>
+        <w:rPr>
+          <w:sz w:val="28"/>
+          <w:szCs w:val="28"/>
+        </w:rPr>
+        <w:drawing>
+          <wp:inline distT="0" distB="0" distL="0" distR="0" wp14:anchorId="2CF2202D" wp14:editId="5FC91DF6">
+            <wp:extent cx="3635055" cy="1722269"/>
+            <wp:effectExtent l="0" t="0" r="3810" b="0"/>
+            <wp:docPr id="1723555545" name="Picture 1"/>
+            <wp:cNvGraphicFramePr>
+              <a:graphicFrameLocks xmlns:a="http://schemas.openxmlformats.org/drawingml/2006/main" noChangeAspect="1"/>
+            </wp:cNvGraphicFramePr>
+            <a:graphic xmlns:a="http://schemas.openxmlformats.org/drawingml/2006/main">
+              <a:graphicData uri="http://schemas.openxmlformats.org/drawingml/2006/picture">
+                <pic:pic xmlns:pic="http://schemas.openxmlformats.org/drawingml/2006/picture">
+                  <pic:nvPicPr>
+                    <pic:cNvPr id="1723555545" name=""/>
+                    <pic:cNvPicPr/>
+                  </pic:nvPicPr>
+                  <pic:blipFill>
+                    <a:blip r:embed="rId27"/>
+                    <a:stretch>
+                      <a:fillRect/>
+                    </a:stretch>
+                  </pic:blipFill>
+                  <pic:spPr>
+                    <a:xfrm>
+                      <a:off x="0" y="0"/>
+                      <a:ext cx="3635055" cy="1722269"/>
+                    </a:xfrm>
+                    <a:prstGeom prst="rect">
+                      <a:avLst/>
+                    </a:prstGeom>
+                  </pic:spPr>
+                </pic:pic>
+              </a:graphicData>
+            </a:graphic>
+          </wp:inline>
+        </w:drawing>
+      </w:r>
+    </w:p>
+    <w:p>
+      <w:pPr>
+        <w:rPr>
+          <w:sz w:val="28"/>
+          <w:szCs w:val="28"/>
+        </w:rPr>
+      </w:pPr>
+    </w:p>
+    <w:p>
+      <w:pPr>
+        <w:rPr>
+          <w:sz w:val="28"/>
+          <w:szCs w:val="28"/>
+        </w:rPr>
+      </w:pPr>
+      <w:r>
+        <w:rPr>
+          <w:sz w:val="28"/>
+          <w:szCs w:val="28"/>
+        </w:rPr>
+        <w:t xml:space="preserve">Next, I altered the pair transaction to also include second pairs, creating 2 possibilities if there is a pair found. </w:t>
+      </w:r>
+    </w:p>
+    <w:p>
+      <w:pPr>
+        <w:rPr>
+          <w:sz w:val="28"/>
+          <w:szCs w:val="28"/>
+        </w:rPr>
+      </w:pPr>
+      <w:r>
+        <w:rPr>
+          <w:sz w:val="28"/>
+          <w:szCs w:val="28"/>
+        </w:rPr>
+        <w:t xml:space="preserve">1 – There hasn`t been another pair found yet – the transactions </w:t>
+      </w:r>
+      <w:proofErr w:type="gramStart"/>
+      <w:r>
+        <w:rPr>
+          <w:sz w:val="28"/>
+          <w:szCs w:val="28"/>
+        </w:rPr>
+        <w:t>runs</w:t>
+      </w:r>
+      <w:proofErr w:type="gramEnd"/>
+      <w:r>
+        <w:rPr>
+          <w:sz w:val="28"/>
+          <w:szCs w:val="28"/>
+        </w:rPr>
+        <w:t xml:space="preserve"> as it did before</w:t>
+      </w:r>
+    </w:p>
+    <w:p>
+      <w:pPr>
+        <w:rPr>
+          <w:sz w:val="28"/>
+          <w:szCs w:val="28"/>
+        </w:rPr>
+      </w:pPr>
+      <w:r>
+        <w:rPr>
+          <w:sz w:val="28"/>
+          <w:szCs w:val="28"/>
+        </w:rPr>
+        <w:t>2 – Another unique pair was found – The bigger pair becomes Pair_num and the smaller pair becomes Second_pair</w:t>
+      </w:r>
+    </w:p>
+    <w:p>
+      <w:pPr>
+        <w:rPr>
+          <w:sz w:val="28"/>
+          <w:szCs w:val="28"/>
+        </w:rPr>
+      </w:pPr>
+      <w:r>
+        <w:rPr>
+          <w:sz w:val="28"/>
+          <w:szCs w:val="28"/>
+        </w:rPr>
+        <w:t xml:space="preserve">The “Counter” variable helps identify if another pair is present, and </w:t>
+      </w:r>
+      <w:proofErr w:type="gramStart"/>
+      <w:r>
+        <w:rPr>
+          <w:sz w:val="28"/>
+          <w:szCs w:val="28"/>
+        </w:rPr>
+        <w:t>the !</w:t>
+      </w:r>
+      <w:proofErr w:type="gramEnd"/>
+      <w:r>
+        <w:rPr>
+          <w:sz w:val="28"/>
+          <w:szCs w:val="28"/>
+        </w:rPr>
+        <w:t xml:space="preserve">= Pair_num stops 3OAK from being </w:t>
+      </w:r>
+      <w:proofErr w:type="spellStart"/>
+      <w:r>
+        <w:rPr>
+          <w:sz w:val="28"/>
+          <w:szCs w:val="28"/>
+        </w:rPr>
+        <w:t>re evaluated</w:t>
+      </w:r>
+      <w:proofErr w:type="spellEnd"/>
+      <w:r>
+        <w:rPr>
+          <w:sz w:val="28"/>
+          <w:szCs w:val="28"/>
+        </w:rPr>
+        <w:t>.</w:t>
+      </w:r>
+    </w:p>
+    <w:p>
+      <w:pPr>
+        <w:rPr>
+          <w:sz w:val="28"/>
+          <w:szCs w:val="28"/>
+        </w:rPr>
+      </w:pPr>
+      <w:r>
+        <w:rPr>
+          <w:sz w:val="28"/>
+          <w:szCs w:val="28"/>
+        </w:rPr>
+        <w:lastRenderedPageBreak/>
+        <w:drawing>
+          <wp:inline distT="0" distB="0" distL="0" distR="0" wp14:anchorId="74975DA0" wp14:editId="66A61854">
+            <wp:extent cx="5097780" cy="1722040"/>
+            <wp:effectExtent l="0" t="0" r="7620" b="0"/>
+            <wp:docPr id="1558978641" name="Picture 1"/>
+            <wp:cNvGraphicFramePr>
+              <a:graphicFrameLocks xmlns:a="http://schemas.openxmlformats.org/drawingml/2006/main" noChangeAspect="1"/>
+            </wp:cNvGraphicFramePr>
+            <a:graphic xmlns:a="http://schemas.openxmlformats.org/drawingml/2006/main">
+              <a:graphicData uri="http://schemas.openxmlformats.org/drawingml/2006/picture">
+                <pic:pic xmlns:pic="http://schemas.openxmlformats.org/drawingml/2006/picture">
+                  <pic:nvPicPr>
+                    <pic:cNvPr id="1558978641" name=""/>
+                    <pic:cNvPicPr/>
+                  </pic:nvPicPr>
+                  <pic:blipFill>
+                    <a:blip r:embed="rId28"/>
+                    <a:stretch>
+                      <a:fillRect/>
+                    </a:stretch>
+                  </pic:blipFill>
+                  <pic:spPr>
+                    <a:xfrm>
+                      <a:off x="0" y="0"/>
+                      <a:ext cx="5109578" cy="1726025"/>
+                    </a:xfrm>
+                    <a:prstGeom prst="rect">
+                      <a:avLst/>
+                    </a:prstGeom>
+                  </pic:spPr>
+                </pic:pic>
+              </a:graphicData>
+            </a:graphic>
+          </wp:inline>
+        </w:drawing>
+      </w:r>
+    </w:p>
+    <w:p>
+      <w:pPr>
+        <w:rPr>
+          <w:sz w:val="28"/>
+          <w:szCs w:val="28"/>
+        </w:rPr>
+      </w:pPr>
+    </w:p>
+    <w:p>
+      <w:pPr>
+        <w:rPr>
+          <w:sz w:val="28"/>
+          <w:szCs w:val="28"/>
+        </w:rPr>
+      </w:pPr>
+      <w:r>
+        <w:rPr>
+          <w:sz w:val="28"/>
+          <w:szCs w:val="28"/>
+        </w:rPr>
+        <w:t>After, the hardest transaction of Full house was made, although the refinement took longer than for straight flush to be completed.</w:t>
+      </w:r>
+    </w:p>
+    <w:p>
+      <w:pPr>
+        <w:rPr>
+          <w:sz w:val="28"/>
+          <w:szCs w:val="28"/>
+        </w:rPr>
+      </w:pPr>
+      <w:r>
+        <w:rPr>
+          <w:sz w:val="28"/>
+          <w:szCs w:val="28"/>
+        </w:rPr>
+        <w:t xml:space="preserve">The hardest part is making sure it gets accurately counted while not impacting 3OAK or Two pair, but the final check was to ensure </w:t>
+      </w:r>
+      <w:proofErr w:type="spellStart"/>
+      <w:r>
+        <w:rPr>
+          <w:sz w:val="28"/>
+          <w:szCs w:val="28"/>
+        </w:rPr>
+        <w:t>Triple_num</w:t>
+      </w:r>
+      <w:proofErr w:type="spellEnd"/>
+      <w:r>
+        <w:rPr>
+          <w:sz w:val="28"/>
+          <w:szCs w:val="28"/>
+        </w:rPr>
+        <w:t xml:space="preserve"> and Second_pair were 2 distinct values that were both greater than 0, and there were also more than 1 pair found with counter, then it would properly evaluate a full house. Since the pair module must have also come before 3OAK, extra steps had to be put in place to ensure everything was accurate</w:t>
+      </w:r>
+    </w:p>
+    <w:p>
+      <w:pPr>
+        <w:rPr>
+          <w:sz w:val="28"/>
+          <w:szCs w:val="28"/>
+        </w:rPr>
+      </w:pPr>
+      <w:r>
+        <w:rPr>
+          <w:sz w:val="28"/>
+          <w:szCs w:val="28"/>
+        </w:rPr>
+        <w:drawing>
+          <wp:inline distT="0" distB="0" distL="0" distR="0" wp14:anchorId="773F34F9" wp14:editId="4EE03D33">
+            <wp:extent cx="3147333" cy="1242168"/>
+            <wp:effectExtent l="0" t="0" r="0" b="0"/>
+            <wp:docPr id="1085290754" name="Picture 1"/>
+            <wp:cNvGraphicFramePr>
+              <a:graphicFrameLocks xmlns:a="http://schemas.openxmlformats.org/drawingml/2006/main" noChangeAspect="1"/>
+            </wp:cNvGraphicFramePr>
+            <a:graphic xmlns:a="http://schemas.openxmlformats.org/drawingml/2006/main">
+              <a:graphicData uri="http://schemas.openxmlformats.org/drawingml/2006/picture">
+                <pic:pic xmlns:pic="http://schemas.openxmlformats.org/drawingml/2006/picture">
+                  <pic:nvPicPr>
+                    <pic:cNvPr id="1085290754" name=""/>
+                    <pic:cNvPicPr/>
+                  </pic:nvPicPr>
+                  <pic:blipFill>
+                    <a:blip r:embed="rId29"/>
+                    <a:stretch>
+                      <a:fillRect/>
+                    </a:stretch>
+                  </pic:blipFill>
+                  <pic:spPr>
+                    <a:xfrm>
+                      <a:off x="0" y="0"/>
+                      <a:ext cx="3147333" cy="1242168"/>
+                    </a:xfrm>
+                    <a:prstGeom prst="rect">
+                      <a:avLst/>
+                    </a:prstGeom>
+                  </pic:spPr>
+                </pic:pic>
+              </a:graphicData>
+            </a:graphic>
+          </wp:inline>
+        </w:drawing>
+      </w:r>
+    </w:p>
+    <w:p>
+      <w:pPr>
+        <w:rPr>
+          <w:sz w:val="28"/>
+          <w:szCs w:val="28"/>
+        </w:rPr>
+      </w:pPr>
+      <w:r>
+        <w:rPr>
+          <w:sz w:val="28"/>
+          <w:szCs w:val="28"/>
+        </w:rPr>
+        <w:drawing>
+          <wp:inline distT="0" distB="0" distL="0" distR="0" wp14:anchorId="4B8182CB" wp14:editId="42837F83">
+            <wp:extent cx="3368332" cy="1714649"/>
+            <wp:effectExtent l="0" t="0" r="3810" b="0"/>
+            <wp:docPr id="202220704" name="Picture 1"/>
+            <wp:cNvGraphicFramePr>
+              <a:graphicFrameLocks xmlns:a="http://schemas.openxmlformats.org/drawingml/2006/main" noChangeAspect="1"/>
+            </wp:cNvGraphicFramePr>
+            <a:graphic xmlns:a="http://schemas.openxmlformats.org/drawingml/2006/main">
+              <a:graphicData uri="http://schemas.openxmlformats.org/drawingml/2006/picture">
+                <pic:pic xmlns:pic="http://schemas.openxmlformats.org/drawingml/2006/picture">
+                  <pic:nvPicPr>
+                    <pic:cNvPr id="202220704" name=""/>
+                    <pic:cNvPicPr/>
+                  </pic:nvPicPr>
+                  <pic:blipFill>
+                    <a:blip r:embed="rId30"/>
+                    <a:stretch>
+                      <a:fillRect/>
+                    </a:stretch>
+                  </pic:blipFill>
+                  <pic:spPr>
+                    <a:xfrm>
+                      <a:off x="0" y="0"/>
+                      <a:ext cx="3368332" cy="1714649"/>
+                    </a:xfrm>
+                    <a:prstGeom prst="rect">
+                      <a:avLst/>
+                    </a:prstGeom>
+                  </pic:spPr>
+                </pic:pic>
+              </a:graphicData>
+            </a:graphic>
+          </wp:inline>
+        </w:drawing>
+      </w:r>
+    </w:p>
+    <w:p>
+      <w:pPr>
+        <w:rPr>
+          <w:sz w:val="28"/>
+          <w:szCs w:val="28"/>
+        </w:rPr>
+      </w:pPr>
+    </w:p>
+    <w:p>
+      <w:pPr>
+        <w:rPr>
+          <w:sz w:val="28"/>
+          <w:szCs w:val="28"/>
+        </w:rPr>
+      </w:pPr>
+    </w:p>
+    <w:p>
+      <w:pPr>
+        <w:rPr>
+          <w:sz w:val="28"/>
+          <w:szCs w:val="28"/>
+        </w:rPr>
+      </w:pPr>
+    </w:p>
+    <w:p>
+      <w:pPr>
+        <w:rPr>
+          <w:sz w:val="28"/>
+          <w:szCs w:val="28"/>
+        </w:rPr>
+      </w:pPr>
+      <w:r>
+        <w:rPr>
+          <w:sz w:val="28"/>
+          <w:szCs w:val="28"/>
+        </w:rPr>
+        <w:lastRenderedPageBreak/>
+        <w:t>Finally, Straight flushes were evaluated. I left them last because I had falsely assumed I would just need to check if both a straight and a flush had occurred, but with 7 cards it`s possible for there to be a straight and a flush, without having 5 consecutive cards of the same flush. Exceedingly rare, but arguably more common than a natural straight flush.</w:t>
+      </w:r>
+    </w:p>
+    <w:p>
+      <w:pPr>
+        <w:rPr>
+          <w:sz w:val="28"/>
+          <w:szCs w:val="28"/>
+        </w:rPr>
+      </w:pPr>
+    </w:p>
+    <w:p>
+      <w:pPr>
+        <w:rPr>
+          <w:sz w:val="28"/>
+          <w:szCs w:val="28"/>
+        </w:rPr>
+      </w:pPr>
+      <w:r>
+        <w:rPr>
+          <w:sz w:val="28"/>
+          <w:szCs w:val="28"/>
+        </w:rPr>
+        <w:t>The transaction beings by checking that there has been a straight and a flush, then adds the index of every number that is part of the flush, stored in blank</w:t>
+      </w:r>
+    </w:p>
+    <w:p>
+      <w:pPr>
+        <w:rPr>
+          <w:sz w:val="28"/>
+          <w:szCs w:val="28"/>
+        </w:rPr>
+      </w:pPr>
+      <w:r>
+        <w:rPr>
+          <w:sz w:val="28"/>
+          <w:szCs w:val="28"/>
+        </w:rPr>
+        <w:t>After, it adds the corresponding values to Temp_list, then removes duplicates. The result being that we are now searching for a straight inside only the numbers part of the flush</w:t>
+      </w:r>
+    </w:p>
+    <w:p>
+      <w:pPr>
+        <w:rPr>
+          <w:sz w:val="28"/>
+          <w:szCs w:val="28"/>
+        </w:rPr>
+      </w:pPr>
+      <w:proofErr w:type="gramStart"/>
+      <w:r>
+        <w:rPr>
+          <w:sz w:val="28"/>
+          <w:szCs w:val="28"/>
+        </w:rPr>
+        <w:t>Finally</w:t>
+      </w:r>
+      <w:proofErr w:type="gramEnd"/>
+      <w:r>
+        <w:rPr>
+          <w:sz w:val="28"/>
+          <w:szCs w:val="28"/>
+        </w:rPr>
+        <w:t xml:space="preserve"> it runs the same process as the straight on the new list of numbers, the only extra checking being if the straight flush contains an ace, king and queen, meaning it`s a royal flush, the best hand in poker.</w:t>
+      </w:r>
+    </w:p>
+    <w:p>
+      <w:pPr>
+        <w:rPr>
+          <w:sz w:val="28"/>
+          <w:szCs w:val="28"/>
+        </w:rPr>
+      </w:pPr>
+      <w:r>
+        <w:rPr>
+          <w:sz w:val="28"/>
+          <w:szCs w:val="28"/>
+        </w:rPr>
+        <w:drawing>
+          <wp:inline distT="0" distB="0" distL="0" distR="0" wp14:anchorId="33CD9987" wp14:editId="02F916C7">
+            <wp:extent cx="5731510" cy="3255645"/>
+            <wp:effectExtent l="0" t="0" r="2540" b="1905"/>
+            <wp:docPr id="572350942" name="Picture 1"/>
+            <wp:cNvGraphicFramePr>
+              <a:graphicFrameLocks xmlns:a="http://schemas.openxmlformats.org/drawingml/2006/main" noChangeAspect="1"/>
+            </wp:cNvGraphicFramePr>
+            <a:graphic xmlns:a="http://schemas.openxmlformats.org/drawingml/2006/main">
+              <a:graphicData uri="http://schemas.openxmlformats.org/drawingml/2006/picture">
+                <pic:pic xmlns:pic="http://schemas.openxmlformats.org/drawingml/2006/picture">
+                  <pic:nvPicPr>
+                    <pic:cNvPr id="572350942" name=""/>
+                    <pic:cNvPicPr/>
+                  </pic:nvPicPr>
+                  <pic:blipFill>
+                    <a:blip r:embed="rId31"/>
+                    <a:stretch>
+                      <a:fillRect/>
+                    </a:stretch>
+                  </pic:blipFill>
+                  <pic:spPr>
+                    <a:xfrm>
+                      <a:off x="0" y="0"/>
+                      <a:ext cx="5731510" cy="3255645"/>
+                    </a:xfrm>
+                    <a:prstGeom prst="rect">
+                      <a:avLst/>
+                    </a:prstGeom>
+                  </pic:spPr>
+                </pic:pic>
+              </a:graphicData>
+            </a:graphic>
+          </wp:inline>
+        </w:drawing>
+      </w:r>
+    </w:p>
+    <w:p>
+      <w:pPr>
+        <w:rPr>
+          <w:sz w:val="28"/>
+          <w:szCs w:val="28"/>
+        </w:rPr>
+      </w:pPr>
+    </w:p>
+    <w:p>
+      <w:pPr>
+        <w:rPr>
+          <w:sz w:val="28"/>
+          <w:szCs w:val="28"/>
+        </w:rPr>
+      </w:pPr>
+    </w:p>
+    <w:p>
+      <w:pPr>
+        <w:rPr>
+          <w:sz w:val="28"/>
+          <w:szCs w:val="28"/>
+        </w:rPr>
+      </w:pPr>
+    </w:p>
+    <w:p>
+      <w:pPr>
+        <w:rPr>
+          <w:sz w:val="28"/>
+          <w:szCs w:val="28"/>
+        </w:rPr>
+      </w:pPr>
+      <w:r>
+        <w:rPr>
+          <w:sz w:val="28"/>
+          <w:szCs w:val="28"/>
+        </w:rPr>
+        <w:lastRenderedPageBreak/>
+        <w:t>After each potential hand has been evaluated, the program printed the winner. The wording of the printing refined itself over time until eventually being remade with the Gui, but for most the codes life the printing segment looked like:</w:t>
+      </w:r>
+      <w:r>
+        <w:rPr>
+          <w:sz w:val="28"/>
+          <w:szCs w:val="28"/>
+        </w:rPr>
+        <w:t xml:space="preserve"> </w:t>
+      </w:r>
+    </w:p>
+    <w:p>
+      <w:pPr>
+        <w:rPr>
+          <w:sz w:val="28"/>
+          <w:szCs w:val="28"/>
+        </w:rPr>
+      </w:pPr>
+      <w:r>
+        <w:rPr>
+          <w:sz w:val="28"/>
+          <w:szCs w:val="28"/>
+        </w:rPr>
+        <w:drawing>
+          <wp:inline distT="0" distB="0" distL="0" distR="0" wp14:anchorId="3A493DCA" wp14:editId="26D44647">
+            <wp:extent cx="4823878" cy="3368332"/>
+            <wp:effectExtent l="0" t="0" r="0" b="3810"/>
+            <wp:docPr id="1533677446" name="Picture 1"/>
+            <wp:cNvGraphicFramePr>
+              <a:graphicFrameLocks xmlns:a="http://schemas.openxmlformats.org/drawingml/2006/main" noChangeAspect="1"/>
+            </wp:cNvGraphicFramePr>
+            <a:graphic xmlns:a="http://schemas.openxmlformats.org/drawingml/2006/main">
+              <a:graphicData uri="http://schemas.openxmlformats.org/drawingml/2006/picture">
+                <pic:pic xmlns:pic="http://schemas.openxmlformats.org/drawingml/2006/picture">
+                  <pic:nvPicPr>
+                    <pic:cNvPr id="1533677446" name=""/>
+                    <pic:cNvPicPr/>
+                  </pic:nvPicPr>
+                  <pic:blipFill>
+                    <a:blip r:embed="rId32"/>
+                    <a:stretch>
+                      <a:fillRect/>
+                    </a:stretch>
+                  </pic:blipFill>
+                  <pic:spPr>
+                    <a:xfrm>
+                      <a:off x="0" y="0"/>
+                      <a:ext cx="4823878" cy="3368332"/>
+                    </a:xfrm>
+                    <a:prstGeom prst="rect">
+                      <a:avLst/>
+                    </a:prstGeom>
+                  </pic:spPr>
+                </pic:pic>
+              </a:graphicData>
+            </a:graphic>
+          </wp:inline>
+        </w:drawing>
+      </w:r>
+    </w:p>
+    <w:p>
+      <w:pPr>
+        <w:rPr>
+          <w:sz w:val="28"/>
+          <w:szCs w:val="28"/>
+        </w:rPr>
+      </w:pPr>
+      <w:r>
+        <w:rPr>
+          <w:sz w:val="28"/>
+          <w:szCs w:val="28"/>
+        </w:rPr>
+        <w:t xml:space="preserve">The </w:t>
+      </w:r>
+      <w:proofErr w:type="spellStart"/>
+      <w:r>
+        <w:rPr>
+          <w:sz w:val="28"/>
+          <w:szCs w:val="28"/>
+        </w:rPr>
+        <w:t>sep</w:t>
+      </w:r>
+      <w:proofErr w:type="spellEnd"/>
+      <w:r>
+        <w:rPr>
+          <w:sz w:val="28"/>
+          <w:szCs w:val="28"/>
+        </w:rPr>
+        <w:t xml:space="preserve"> = “” was used to remove the space between the number and the s, as otherwise it looked horrible. </w:t>
+      </w:r>
+    </w:p>
+    <w:p>
+      <w:pPr>
+        <w:rPr>
+          <w:sz w:val="28"/>
+          <w:szCs w:val="28"/>
+        </w:rPr>
+      </w:pPr>
+    </w:p>
+    <w:p>
+      <w:pPr>
+        <w:rPr>
+          <w:sz w:val="28"/>
+          <w:szCs w:val="28"/>
+        </w:rPr>
+      </w:pPr>
+    </w:p>
+    <w:p>
+      <w:pPr>
+        <w:rPr>
+          <w:sz w:val="28"/>
+          <w:szCs w:val="28"/>
+        </w:rPr>
+      </w:pPr>
+    </w:p>
+    <w:p>
+      <w:pPr>
+        <w:rPr>
+          <w:sz w:val="28"/>
+          <w:szCs w:val="28"/>
+        </w:rPr>
+      </w:pPr>
+    </w:p>
+    <w:p>
+      <w:pPr>
+        <w:rPr>
+          <w:sz w:val="28"/>
+          <w:szCs w:val="28"/>
+        </w:rPr>
+      </w:pPr>
+    </w:p>
+    <w:p>
+      <w:pPr>
+        <w:rPr>
+          <w:sz w:val="28"/>
+          <w:szCs w:val="28"/>
+        </w:rPr>
+      </w:pPr>
+    </w:p>
+    <w:p>
+      <w:pPr>
+        <w:rPr>
+          <w:sz w:val="28"/>
+          <w:szCs w:val="28"/>
+        </w:rPr>
+      </w:pPr>
+    </w:p>
+    <w:p>
+      <w:pPr>
+        <w:rPr>
+          <w:sz w:val="28"/>
+          <w:szCs w:val="28"/>
+        </w:rPr>
+      </w:pPr>
+    </w:p>
+    <w:p>
+      <w:pPr>
+        <w:rPr>
+          <w:sz w:val="28"/>
+          <w:szCs w:val="28"/>
+        </w:rPr>
+      </w:pPr>
+    </w:p>
+    <w:p>
+      <w:pPr>
+        <w:rPr>
+          <w:sz w:val="28"/>
+          <w:szCs w:val="28"/>
+        </w:rPr>
+      </w:pPr>
+    </w:p>
+    <w:p>
+      <w:pPr>
+        <w:rPr>
+          <w:sz w:val="28"/>
+          <w:szCs w:val="28"/>
+        </w:rPr>
+      </w:pPr>
+      <w:r>
+        <w:rPr>
+          <w:sz w:val="28"/>
+          <w:szCs w:val="28"/>
+        </w:rPr>
+        <w:lastRenderedPageBreak/>
+        <w:t xml:space="preserve">With that milestone complete, the next process was to generate an indefinite amount of computer cards, then run the ranking system and determine which </w:t>
+      </w:r>
+      <w:r>
+        <w:rPr>
+          <w:sz w:val="28"/>
+          <w:szCs w:val="28"/>
+        </w:rPr>
+        <w:t xml:space="preserve">player </w:t>
+      </w:r>
+      <w:r>
+        <w:rPr>
+          <w:sz w:val="28"/>
+          <w:szCs w:val="28"/>
+        </w:rPr>
+        <w:t>had the best hand</w:t>
+      </w:r>
+      <w:r>
+        <w:rPr>
+          <w:sz w:val="28"/>
+          <w:szCs w:val="28"/>
+        </w:rPr>
+        <w:t>.</w:t>
+      </w:r>
+    </w:p>
+    <w:p>
+      <w:pPr>
+        <w:rPr>
+          <w:sz w:val="28"/>
+          <w:szCs w:val="28"/>
+        </w:rPr>
+      </w:pPr>
+      <w:r>
+        <w:rPr>
+          <w:sz w:val="28"/>
+          <w:szCs w:val="28"/>
+        </w:rPr>
+        <w:t>There are 3 things to consider when comparing a hand against another hand</w:t>
+      </w:r>
+    </w:p>
+    <w:p>
+      <w:pPr>
+        <w:rPr>
+          <w:sz w:val="28"/>
+          <w:szCs w:val="28"/>
+        </w:rPr>
+      </w:pPr>
+      <w:r>
+        <w:rPr>
+          <w:sz w:val="28"/>
+          <w:szCs w:val="28"/>
+        </w:rPr>
+        <w:t>Score – A straight beats a pair, this has been solved with the previous milestone</w:t>
+      </w:r>
+    </w:p>
+    <w:p>
+      <w:pPr>
+        <w:rPr>
+          <w:sz w:val="28"/>
+          <w:szCs w:val="28"/>
+        </w:rPr>
+      </w:pPr>
+      <w:r>
+        <w:rPr>
+          <w:sz w:val="28"/>
+          <w:szCs w:val="28"/>
+        </w:rPr>
+        <w:t>Mini rank – Saying a pair of 5`s wins against a pair of 3`s, or A 10 high straight is better than an 8 high straight</w:t>
+      </w:r>
+    </w:p>
+    <w:p>
+      <w:pPr>
+        <w:rPr>
+          <w:sz w:val="28"/>
+          <w:szCs w:val="28"/>
+        </w:rPr>
+      </w:pPr>
+      <w:r>
+        <w:rPr>
+          <w:sz w:val="28"/>
+          <w:szCs w:val="28"/>
+        </w:rPr>
+        <w:t xml:space="preserve">Kicker – Normal poker dictates that a player makes their best “5 card hand”, meaning that a pair would use the next 3 highest cards as a point of comparison. </w:t>
+      </w:r>
+      <w:proofErr w:type="gramStart"/>
+      <w:r>
+        <w:rPr>
+          <w:sz w:val="28"/>
+          <w:szCs w:val="28"/>
+        </w:rPr>
+        <w:t>So</w:t>
+      </w:r>
+      <w:proofErr w:type="gramEnd"/>
+      <w:r>
+        <w:rPr>
+          <w:sz w:val="28"/>
+          <w:szCs w:val="28"/>
+        </w:rPr>
+        <w:t xml:space="preserve"> if both players had a pair of 5`s, but player One has a 10,5 and 4 and player Two has a King, 3,2, Then player 2 would win as a king is stronger than a 10.</w:t>
+      </w:r>
+    </w:p>
+    <w:p>
+      <w:pPr>
+        <w:rPr>
+          <w:sz w:val="28"/>
+          <w:szCs w:val="28"/>
+        </w:rPr>
+      </w:pPr>
+    </w:p>
+    <w:p>
+      <w:pPr>
+        <w:rPr>
+          <w:sz w:val="28"/>
+          <w:szCs w:val="28"/>
+        </w:rPr>
+      </w:pPr>
+    </w:p>
+    <w:p>
+      <w:pPr>
+        <w:rPr>
+          <w:sz w:val="28"/>
+          <w:szCs w:val="28"/>
+        </w:rPr>
+      </w:pPr>
+      <w:r>
+        <w:rPr>
+          <w:sz w:val="28"/>
+          <w:szCs w:val="28"/>
+        </w:rPr>
+        <w:t>Mini rank was simpler, going back to each transaction and making the largest value the Mini rank. For Full houses and Two pair, A second Mini rank was needed.</w:t>
+      </w:r>
+    </w:p>
+    <w:p>
+      <w:pPr>
+        <w:rPr>
+          <w:sz w:val="28"/>
+          <w:szCs w:val="28"/>
+        </w:rPr>
+      </w:pPr>
+      <w:r>
+        <w:rPr>
+          <w:sz w:val="28"/>
+          <w:szCs w:val="28"/>
+        </w:rPr>
+        <w:t>For “number” high hands, Mini rank added the necessity to add an extra transaction, checking if the score was 0, then making the largest number the Mini rank</w:t>
+      </w:r>
+    </w:p>
+    <w:p>
+      <w:pPr>
+        <w:rPr>
+          <w:sz w:val="28"/>
+          <w:szCs w:val="28"/>
+        </w:rPr>
+      </w:pPr>
+      <w:r>
+        <w:rPr>
+          <w:sz w:val="28"/>
+          <w:szCs w:val="28"/>
+        </w:rPr>
+        <w:drawing>
+          <wp:inline distT="0" distB="0" distL="0" distR="0" wp14:anchorId="689A2847" wp14:editId="7D082B5A">
+            <wp:extent cx="2728196" cy="1234547"/>
+            <wp:effectExtent l="0" t="0" r="0" b="3810"/>
+            <wp:docPr id="739529396" name="Picture 1"/>
+            <wp:cNvGraphicFramePr>
+              <a:graphicFrameLocks xmlns:a="http://schemas.openxmlformats.org/drawingml/2006/main" noChangeAspect="1"/>
+            </wp:cNvGraphicFramePr>
+            <a:graphic xmlns:a="http://schemas.openxmlformats.org/drawingml/2006/main">
+              <a:graphicData uri="http://schemas.openxmlformats.org/drawingml/2006/picture">
+                <pic:pic xmlns:pic="http://schemas.openxmlformats.org/drawingml/2006/picture">
+                  <pic:nvPicPr>
+                    <pic:cNvPr id="739529396" name=""/>
+                    <pic:cNvPicPr/>
+                  </pic:nvPicPr>
+                  <pic:blipFill>
+                    <a:blip r:embed="rId33"/>
+                    <a:stretch>
+                      <a:fillRect/>
+                    </a:stretch>
+                  </pic:blipFill>
+                  <pic:spPr>
+                    <a:xfrm>
+                      <a:off x="0" y="0"/>
+                      <a:ext cx="2728196" cy="1234547"/>
+                    </a:xfrm>
+                    <a:prstGeom prst="rect">
+                      <a:avLst/>
+                    </a:prstGeom>
+                  </pic:spPr>
+                </pic:pic>
+              </a:graphicData>
+            </a:graphic>
+          </wp:inline>
+        </w:drawing>
+      </w:r>
+    </w:p>
+    <w:p>
+      <w:pPr>
+        <w:rPr>
+          <w:sz w:val="28"/>
+          <w:szCs w:val="28"/>
+        </w:rPr>
+      </w:pPr>
+    </w:p>
+    <w:p>
+      <w:pPr>
+        <w:rPr>
+          <w:sz w:val="28"/>
+          <w:szCs w:val="28"/>
+        </w:rPr>
+      </w:pPr>
+      <w:r>
+        <w:rPr>
+          <w:sz w:val="28"/>
+          <w:szCs w:val="28"/>
+        </w:rPr>
+        <w:lastRenderedPageBreak/>
+        <w:t>For kicker, a case-by-case basis was needed. For Straights, Flushes, Full houses and Straight flushes, a kicker is not needed as these hands already require 5 cards to form each hand.</w:t>
+      </w:r>
+    </w:p>
+    <w:p>
+      <w:pPr>
+        <w:rPr>
+          <w:sz w:val="28"/>
+          <w:szCs w:val="28"/>
+        </w:rPr>
+      </w:pPr>
+      <w:r>
+        <w:rPr>
+          <w:sz w:val="28"/>
+          <w:szCs w:val="28"/>
+        </w:rPr>
+        <w:t xml:space="preserve">For 4 of a kind and every hand weaker than a straight, </w:t>
+      </w:r>
+      <w:r>
+        <w:rPr>
+          <w:sz w:val="28"/>
+          <w:szCs w:val="28"/>
+        </w:rPr>
+        <w:t>A kicker is determined. This happens by reversing the order of Num_list, then finding the largest value that isn`t a part of a pair or 3OAK, and setting that number as the Kicker</w:t>
+      </w:r>
+    </w:p>
+    <w:p>
+      <w:pPr>
+        <w:rPr>
+          <w:sz w:val="28"/>
+          <w:szCs w:val="28"/>
+        </w:rPr>
+      </w:pPr>
+      <w:r>
+        <w:rPr>
+          <w:sz w:val="28"/>
+          <w:szCs w:val="28"/>
+        </w:rPr>
+        <w:t xml:space="preserve">For Pairs and 3OAK the process is </w:t>
+      </w:r>
+      <w:proofErr w:type="gramStart"/>
+      <w:r>
+        <w:rPr>
+          <w:sz w:val="28"/>
+          <w:szCs w:val="28"/>
+        </w:rPr>
+        <w:t>repeated again</w:t>
+      </w:r>
+      <w:proofErr w:type="gramEnd"/>
+      <w:r>
+        <w:rPr>
+          <w:sz w:val="28"/>
+          <w:szCs w:val="28"/>
+        </w:rPr>
+        <w:t xml:space="preserve"> except setting that value as Kicker2, then repeated for Pairs and being Appended to Kicker3.</w:t>
+      </w:r>
+    </w:p>
+    <w:p>
+      <w:pPr>
+        <w:rPr>
+          <w:sz w:val="28"/>
+          <w:szCs w:val="28"/>
+        </w:rPr>
+      </w:pPr>
+      <w:r>
+        <w:rPr>
+          <w:sz w:val="28"/>
+          <w:szCs w:val="28"/>
+        </w:rPr>
+        <w:drawing>
+          <wp:inline distT="0" distB="0" distL="0" distR="0" wp14:anchorId="0402849B" wp14:editId="7CD33E31">
+            <wp:extent cx="5731510" cy="3151505"/>
+            <wp:effectExtent l="0" t="0" r="2540" b="0"/>
+            <wp:docPr id="715964239" name="Picture 1"/>
+            <wp:cNvGraphicFramePr>
+              <a:graphicFrameLocks xmlns:a="http://schemas.openxmlformats.org/drawingml/2006/main" noChangeAspect="1"/>
+            </wp:cNvGraphicFramePr>
+            <a:graphic xmlns:a="http://schemas.openxmlformats.org/drawingml/2006/main">
+              <a:graphicData uri="http://schemas.openxmlformats.org/drawingml/2006/picture">
+                <pic:pic xmlns:pic="http://schemas.openxmlformats.org/drawingml/2006/picture">
+                  <pic:nvPicPr>
+                    <pic:cNvPr id="715964239" name=""/>
+                    <pic:cNvPicPr/>
+                  </pic:nvPicPr>
+                  <pic:blipFill>
+                    <a:blip r:embed="rId34"/>
+                    <a:stretch>
+                      <a:fillRect/>
+                    </a:stretch>
+                  </pic:blipFill>
+                  <pic:spPr>
+                    <a:xfrm>
+                      <a:off x="0" y="0"/>
+                      <a:ext cx="5731510" cy="3151505"/>
+                    </a:xfrm>
+                    <a:prstGeom prst="rect">
+                      <a:avLst/>
+                    </a:prstGeom>
+                  </pic:spPr>
+                </pic:pic>
+              </a:graphicData>
+            </a:graphic>
+          </wp:inline>
+        </w:drawing>
+      </w:r>
+    </w:p>
+    <w:p>
+      <w:pPr>
+        <w:rPr>
+          <w:sz w:val="28"/>
+          <w:szCs w:val="28"/>
+        </w:rPr>
+      </w:pPr>
+      <w:r>
+        <w:rPr>
+          <w:sz w:val="28"/>
+          <w:szCs w:val="28"/>
+        </w:rPr>
+        <w:t xml:space="preserve">For specifically high card, for efficiencies sake all kickers are determined next to </w:t>
+      </w:r>
+      <w:proofErr w:type="spellStart"/>
+      <w:r>
+        <w:rPr>
+          <w:sz w:val="28"/>
+          <w:szCs w:val="28"/>
+        </w:rPr>
+        <w:t>Minirank</w:t>
+      </w:r>
+      <w:proofErr w:type="spellEnd"/>
+      <w:r>
+        <w:rPr>
+          <w:sz w:val="28"/>
+          <w:szCs w:val="28"/>
+        </w:rPr>
+        <w:t>, as there are no pairs to dodge when evaluating the kickers, and that we need a Kicker4 just for high card.</w:t>
+      </w:r>
+      <w:r>
+        <w:rPr>
+          <w:sz w:val="28"/>
+          <w:szCs w:val="28"/>
+        </w:rPr>
+        <w:t xml:space="preserve"> </w:t>
+      </w:r>
+      <w:r>
+        <w:rPr>
+          <w:sz w:val="28"/>
+          <w:szCs w:val="28"/>
+        </w:rPr>
+        <w:drawing>
+          <wp:inline distT="0" distB="0" distL="0" distR="0" wp14:anchorId="2FE6310F" wp14:editId="2CF4DBE0">
+            <wp:extent cx="2644423" cy="2217420"/>
+            <wp:effectExtent l="0" t="0" r="3810" b="0"/>
+            <wp:docPr id="577861967" name="Picture 1"/>
+            <wp:cNvGraphicFramePr>
+              <a:graphicFrameLocks xmlns:a="http://schemas.openxmlformats.org/drawingml/2006/main" noChangeAspect="1"/>
+            </wp:cNvGraphicFramePr>
+            <a:graphic xmlns:a="http://schemas.openxmlformats.org/drawingml/2006/main">
+              <a:graphicData uri="http://schemas.openxmlformats.org/drawingml/2006/picture">
+                <pic:pic xmlns:pic="http://schemas.openxmlformats.org/drawingml/2006/picture">
+                  <pic:nvPicPr>
+                    <pic:cNvPr id="577861967" name=""/>
+                    <pic:cNvPicPr/>
+                  </pic:nvPicPr>
+                  <pic:blipFill>
+                    <a:blip r:embed="rId35"/>
+                    <a:stretch>
+                      <a:fillRect/>
+                    </a:stretch>
+                  </pic:blipFill>
+                  <pic:spPr>
+                    <a:xfrm>
+                      <a:off x="0" y="0"/>
+                      <a:ext cx="2645708" cy="2218498"/>
+                    </a:xfrm>
+                    <a:prstGeom prst="rect">
+                      <a:avLst/>
+                    </a:prstGeom>
+                  </pic:spPr>
+                </pic:pic>
+              </a:graphicData>
+            </a:graphic>
+          </wp:inline>
+        </w:drawing>
+      </w:r>
+    </w:p>
+    <w:p>
+      <w:pPr>
+        <w:rPr>
+          <w:sz w:val="28"/>
+          <w:szCs w:val="28"/>
+        </w:rPr>
+      </w:pPr>
+      <w:r>
+        <w:rPr>
+          <w:sz w:val="28"/>
+          <w:szCs w:val="28"/>
+        </w:rPr>
+        <w:lastRenderedPageBreak/>
+        <w:t xml:space="preserve">An updated version of printing happened around this time, using the printer variables to </w:t>
+      </w:r>
+      <w:r>
+        <w:rPr>
+          <w:sz w:val="28"/>
+          <w:szCs w:val="28"/>
+        </w:rPr>
+        <w:t xml:space="preserve">convert each number into </w:t>
+      </w:r>
+      <w:proofErr w:type="spellStart"/>
+      <w:r>
+        <w:rPr>
+          <w:sz w:val="28"/>
+          <w:szCs w:val="28"/>
+        </w:rPr>
+        <w:t>it`s</w:t>
+      </w:r>
+      <w:proofErr w:type="spellEnd"/>
+      <w:r>
+        <w:rPr>
+          <w:sz w:val="28"/>
+          <w:szCs w:val="28"/>
+        </w:rPr>
+        <w:t xml:space="preserve"> poker equivalent. Placeholder and </w:t>
+      </w:r>
+      <w:proofErr w:type="spellStart"/>
+      <w:proofErr w:type="gramStart"/>
+      <w:r>
+        <w:rPr>
+          <w:sz w:val="28"/>
+          <w:szCs w:val="28"/>
+        </w:rPr>
+        <w:t>Second</w:t>
+      </w:r>
+      <w:proofErr w:type="gramEnd"/>
+      <w:r>
+        <w:rPr>
+          <w:sz w:val="28"/>
+          <w:szCs w:val="28"/>
+        </w:rPr>
+        <w:t>_placeholder</w:t>
+      </w:r>
+      <w:proofErr w:type="spellEnd"/>
+      <w:r>
+        <w:rPr>
+          <w:sz w:val="28"/>
+          <w:szCs w:val="28"/>
+        </w:rPr>
+        <w:t xml:space="preserve"> </w:t>
+      </w:r>
+      <w:proofErr w:type="gramStart"/>
+      <w:r>
+        <w:rPr>
+          <w:sz w:val="28"/>
+          <w:szCs w:val="28"/>
+        </w:rPr>
+        <w:t>are</w:t>
+      </w:r>
+      <w:proofErr w:type="gramEnd"/>
+      <w:r>
+        <w:rPr>
+          <w:sz w:val="28"/>
+          <w:szCs w:val="28"/>
+        </w:rPr>
+        <w:t xml:space="preserve"> determined at each transaction, but are usually just the </w:t>
+      </w:r>
+      <w:proofErr w:type="spellStart"/>
+      <w:r>
+        <w:rPr>
+          <w:sz w:val="28"/>
+          <w:szCs w:val="28"/>
+        </w:rPr>
+        <w:t>minirank</w:t>
+      </w:r>
+      <w:proofErr w:type="spellEnd"/>
+      <w:r>
+        <w:rPr>
+          <w:sz w:val="28"/>
+          <w:szCs w:val="28"/>
+        </w:rPr>
+        <w:drawing>
+          <wp:inline distT="0" distB="0" distL="0" distR="0" wp14:anchorId="6A9DC678" wp14:editId="60C34D39">
+            <wp:extent cx="5731510" cy="4915535"/>
+            <wp:effectExtent l="0" t="0" r="2540" b="0"/>
+            <wp:docPr id="794655880" name="Picture 1"/>
+            <wp:cNvGraphicFramePr>
+              <a:graphicFrameLocks xmlns:a="http://schemas.openxmlformats.org/drawingml/2006/main" noChangeAspect="1"/>
+            </wp:cNvGraphicFramePr>
+            <a:graphic xmlns:a="http://schemas.openxmlformats.org/drawingml/2006/main">
+              <a:graphicData uri="http://schemas.openxmlformats.org/drawingml/2006/picture">
+                <pic:pic xmlns:pic="http://schemas.openxmlformats.org/drawingml/2006/picture">
+                  <pic:nvPicPr>
+                    <pic:cNvPr id="794655880" name=""/>
+                    <pic:cNvPicPr/>
+                  </pic:nvPicPr>
+                  <pic:blipFill>
+                    <a:blip r:embed="rId36"/>
+                    <a:stretch>
+                      <a:fillRect/>
+                    </a:stretch>
+                  </pic:blipFill>
+                  <pic:spPr>
+                    <a:xfrm>
+                      <a:off x="0" y="0"/>
+                      <a:ext cx="5731510" cy="4915535"/>
+                    </a:xfrm>
+                    <a:prstGeom prst="rect">
+                      <a:avLst/>
+                    </a:prstGeom>
+                  </pic:spPr>
+                </pic:pic>
+              </a:graphicData>
+            </a:graphic>
+          </wp:inline>
+        </w:drawing>
+      </w:r>
+    </w:p>
+    <w:p>
+      <w:pPr>
+        <w:rPr>
+          <w:sz w:val="28"/>
+          <w:szCs w:val="28"/>
+        </w:rPr>
+      </w:pPr>
+      <w:proofErr w:type="gramStart"/>
+      <w:r>
+        <w:rPr>
+          <w:sz w:val="28"/>
+          <w:szCs w:val="28"/>
+        </w:rPr>
+        <w:t>Finally</w:t>
+      </w:r>
+      <w:proofErr w:type="gramEnd"/>
+      <w:r>
+        <w:rPr>
+          <w:sz w:val="28"/>
+          <w:szCs w:val="28"/>
+        </w:rPr>
+        <w:t xml:space="preserve"> a winner needs to be determined with these values, done by storing the values of Score, the Mini ranks and the kickers in Record Values, then comparing each new Score/</w:t>
+      </w:r>
+      <w:proofErr w:type="spellStart"/>
+      <w:r>
+        <w:rPr>
+          <w:sz w:val="28"/>
+          <w:szCs w:val="28"/>
+        </w:rPr>
+        <w:t>Minirank</w:t>
+      </w:r>
+      <w:proofErr w:type="spellEnd"/>
+      <w:r>
+        <w:rPr>
+          <w:sz w:val="28"/>
+          <w:szCs w:val="28"/>
+        </w:rPr>
+        <w:t>/Kicker with their record equivalent, updating the record Values only if the new hand is better than the original.</w:t>
+      </w:r>
+    </w:p>
+    <w:p>
+      <w:pPr>
+        <w:rPr>
+          <w:sz w:val="28"/>
+          <w:szCs w:val="28"/>
+        </w:rPr>
+      </w:pPr>
+      <w:r>
+        <w:rPr>
+          <w:sz w:val="28"/>
+          <w:szCs w:val="28"/>
+        </w:rPr>
+        <w:t>If each variable is the same as it`s record variant, then it is determined to be a tie, currently only stored a yes or no variable.</w:t>
+      </w:r>
+    </w:p>
+    <w:p>
+      <w:pPr>
+        <w:rPr>
+          <w:sz w:val="28"/>
+          <w:szCs w:val="28"/>
+        </w:rPr>
+      </w:pPr>
+      <w:r>
+        <w:rPr>
+          <w:sz w:val="28"/>
+          <w:szCs w:val="28"/>
+        </w:rPr>
+        <w:lastRenderedPageBreak/>
+        <w:drawing>
+          <wp:inline distT="0" distB="0" distL="0" distR="0" wp14:anchorId="55C75DCA" wp14:editId="5C65E36D">
+            <wp:extent cx="2720576" cy="1905165"/>
+            <wp:effectExtent l="0" t="0" r="3810" b="0"/>
+            <wp:docPr id="1300340454" name="Picture 1"/>
+            <wp:cNvGraphicFramePr>
+              <a:graphicFrameLocks xmlns:a="http://schemas.openxmlformats.org/drawingml/2006/main" noChangeAspect="1"/>
+            </wp:cNvGraphicFramePr>
+            <a:graphic xmlns:a="http://schemas.openxmlformats.org/drawingml/2006/main">
+              <a:graphicData uri="http://schemas.openxmlformats.org/drawingml/2006/picture">
+                <pic:pic xmlns:pic="http://schemas.openxmlformats.org/drawingml/2006/picture">
+                  <pic:nvPicPr>
+                    <pic:cNvPr id="1300340454" name=""/>
+                    <pic:cNvPicPr/>
+                  </pic:nvPicPr>
+                  <pic:blipFill>
+                    <a:blip r:embed="rId37"/>
+                    <a:stretch>
+                      <a:fillRect/>
+                    </a:stretch>
+                  </pic:blipFill>
+                  <pic:spPr>
+                    <a:xfrm>
+                      <a:off x="0" y="0"/>
+                      <a:ext cx="2720576" cy="1905165"/>
+                    </a:xfrm>
+                    <a:prstGeom prst="rect">
+                      <a:avLst/>
+                    </a:prstGeom>
+                  </pic:spPr>
+                </pic:pic>
+              </a:graphicData>
+            </a:graphic>
+          </wp:inline>
+        </w:drawing>
+      </w:r>
+    </w:p>
+    <w:p>
+      <w:pPr>
         <w:rPr>
           <w:sz w:val="28"/>
           <w:szCs w:val="28"/>
@@ -7918,6 +10317,56 @@
     </w:sectPr>
   </w:body>
 </w:document>
+</file>
+
+<file path=word/endnotes.xml><?xml version="1.0" encoding="utf-8"?>
+<w:endnotes xmlns:wpc="http://schemas.microsoft.com/office/word/2010/wordprocessingCanvas" xmlns:cx="http://schemas.microsoft.com/office/drawing/2014/chartex" xmlns:cx1="http://schemas.microsoft.com/office/drawing/2015/9/8/chartex" xmlns:cx2="http://schemas.microsoft.com/office/drawing/2015/10/21/chartex" xmlns:cx3="http://schemas.microsoft.com/office/drawing/2016/5/9/chartex" xmlns:cx4="http://schemas.microsoft.com/office/drawing/2016/5/10/chartex" xmlns:cx5="http://schemas.microsoft.com/office/drawing/2016/5/11/chartex" xmlns:cx6="http://schemas.microsoft.com/office/drawing/2016/5/12/chartex" xmlns:cx7="http://schemas.microsoft.com/office/drawing/2016/5/13/chartex" xmlns:cx8="http://schemas.microsoft.com/office/drawing/2016/5/14/chartex" xmlns:mc="http://schemas.openxmlformats.org/markup-compatibility/2006" xmlns:aink="http://schemas.microsoft.com/office/drawing/2016/ink" xmlns:am3d="http://schemas.microsoft.com/office/drawing/2017/model3d" xmlns:o="urn:schemas-microsoft-com:office:office" xmlns:oel="http://schemas.microsoft.com/office/2019/extlst" xmlns:r="http://schemas.openxmlformats.org/officeDocument/2006/relationships" xmlns:m="http://schemas.openxmlformats.org/officeDocument/2006/math" xmlns:v="urn:schemas-microsoft-com:vml" xmlns:wp14="http://schemas.microsoft.com/office/word/2010/wordprocessingDrawing" xmlns:wp="http://schemas.openxmlformats.org/drawingml/2006/wordprocessingDrawing" xmlns:w10="urn:schemas-microsoft-com:office:word" xmlns:w="http://schemas.openxmlformats.org/wordprocessingml/2006/main" xmlns:w14="http://schemas.microsoft.com/office/word/2010/wordml" xmlns:w15="http://schemas.microsoft.com/office/word/2012/wordml" xmlns:w16cex="http://schemas.microsoft.com/office/word/2018/wordml/cex" xmlns:w16cid="http://schemas.microsoft.com/office/word/2016/wordml/cid" xmlns:w16="http://schemas.microsoft.com/office/word/2018/wordml" xmlns:w16du="http://schemas.microsoft.com/office/word/2023/wordml/word16du" xmlns:w16sdtdh="http://schemas.microsoft.com/office/word/2020/wordml/sdtdatahash" xmlns:w16sdtfl="http://schemas.microsoft.com/office/word/2024/wordml/sdtformatlock" xmlns:w16se="http://schemas.microsoft.com/office/word/2015/wordml/symex" xmlns:wpg="http://schemas.microsoft.com/office/word/2010/wordprocessingGroup" xmlns:wpi="http://schemas.microsoft.com/office/word/2010/wordprocessingInk" xmlns:wne="http://schemas.microsoft.com/office/word/2006/wordml" xmlns:wps="http://schemas.microsoft.com/office/word/2010/wordprocessingShape" mc:Ignorable="w14 w15 w16se w16cid w16 w16cex w16sdtdh w16sdtfl w16du wp14">
+  <w:endnote w:type="separator" w:id="-1">
+    <w:p>
+      <w:pPr>
+        <w:spacing w:after="0" w:line="240" w:lineRule="auto"/>
+      </w:pPr>
+      <w:r>
+        <w:separator/>
+      </w:r>
+    </w:p>
+  </w:endnote>
+  <w:endnote w:type="continuationSeparator" w:id="0">
+    <w:p>
+      <w:pPr>
+        <w:spacing w:after="0" w:line="240" w:lineRule="auto"/>
+      </w:pPr>
+      <w:r>
+        <w:continuationSeparator/>
+      </w:r>
+    </w:p>
+  </w:endnote>
+</w:endnotes>
+</file>
+
+<file path=word/footnotes.xml><?xml version="1.0" encoding="utf-8"?>
+<w:footnotes xmlns:wpc="http://schemas.microsoft.com/office/word/2010/wordprocessingCanvas" xmlns:cx="http://schemas.microsoft.com/office/drawing/2014/chartex" xmlns:cx1="http://schemas.microsoft.com/office/drawing/2015/9/8/chartex" xmlns:cx2="http://schemas.microsoft.com/office/drawing/2015/10/21/chartex" xmlns:cx3="http://schemas.microsoft.com/office/drawing/2016/5/9/chartex" xmlns:cx4="http://schemas.microsoft.com/office/drawing/2016/5/10/chartex" xmlns:cx5="http://schemas.microsoft.com/office/drawing/2016/5/11/chartex" xmlns:cx6="http://schemas.microsoft.com/office/drawing/2016/5/12/chartex" xmlns:cx7="http://schemas.microsoft.com/office/drawing/2016/5/13/chartex" xmlns:cx8="http://schemas.microsoft.com/office/drawing/2016/5/14/chartex" xmlns:mc="http://schemas.openxmlformats.org/markup-compatibility/2006" xmlns:aink="http://schemas.microsoft.com/office/drawing/2016/ink" xmlns:am3d="http://schemas.microsoft.com/office/drawing/2017/model3d" xmlns:o="urn:schemas-microsoft-com:office:office" xmlns:oel="http://schemas.microsoft.com/office/2019/extlst" xmlns:r="http://schemas.openxmlformats.org/officeDocument/2006/relationships" xmlns:m="http://schemas.openxmlformats.org/officeDocument/2006/math" xmlns:v="urn:schemas-microsoft-com:vml" xmlns:wp14="http://schemas.microsoft.com/office/word/2010/wordprocessingDrawing" xmlns:wp="http://schemas.openxmlformats.org/drawingml/2006/wordprocessingDrawing" xmlns:w10="urn:schemas-microsoft-com:office:word" xmlns:w="http://schemas.openxmlformats.org/wordprocessingml/2006/main" xmlns:w14="http://schemas.microsoft.com/office/word/2010/wordml" xmlns:w15="http://schemas.microsoft.com/office/word/2012/wordml" xmlns:w16cex="http://schemas.microsoft.com/office/word/2018/wordml/cex" xmlns:w16cid="http://schemas.microsoft.com/office/word/2016/wordml/cid" xmlns:w16="http://schemas.microsoft.com/office/word/2018/wordml" xmlns:w16du="http://schemas.microsoft.com/office/word/2023/wordml/word16du" xmlns:w16sdtdh="http://schemas.microsoft.com/office/word/2020/wordml/sdtdatahash" xmlns:w16sdtfl="http://schemas.microsoft.com/office/word/2024/wordml/sdtformatlock" xmlns:w16se="http://schemas.microsoft.com/office/word/2015/wordml/symex" xmlns:wpg="http://schemas.microsoft.com/office/word/2010/wordprocessingGroup" xmlns:wpi="http://schemas.microsoft.com/office/word/2010/wordprocessingInk" xmlns:wne="http://schemas.microsoft.com/office/word/2006/wordml" xmlns:wps="http://schemas.microsoft.com/office/word/2010/wordprocessingShape" mc:Ignorable="w14 w15 w16se w16cid w16 w16cex w16sdtdh w16sdtfl w16du wp14">
+  <w:footnote w:type="separator" w:id="-1">
+    <w:p>
+      <w:pPr>
+        <w:spacing w:after="0" w:line="240" w:lineRule="auto"/>
+      </w:pPr>
+      <w:r>
+        <w:separator/>
+      </w:r>
+    </w:p>
+  </w:footnote>
+  <w:footnote w:type="continuationSeparator" w:id="0">
+    <w:p>
+      <w:pPr>
+        <w:spacing w:after="0" w:line="240" w:lineRule="auto"/>
+      </w:pPr>
+      <w:r>
+        <w:continuationSeparator/>
+      </w:r>
+    </w:p>
+  </w:footnote>
+</w:footnotes>
 </file>
 
 <file path=word/numbering.xml><?xml version="1.0" encoding="utf-8"?>
@@ -9064,6 +11513,50 @@
       <w:rFonts w:ascii="Times New Roman" w:hAnsi="Times New Roman" w:cs="Times New Roman"/>
     </w:rPr>
   </w:style>
+  <w:style w:type="paragraph" w:styleId="Header">
+    <w:name w:val="header"/>
+    <w:basedOn w:val="Normal"/>
+    <w:link w:val="HeaderChar"/>
+    <w:uiPriority w:val="99"/>
+    <w:unhideWhenUsed/>
+    <w:rsid w:val="007973AB"/>
+    <w:pPr>
+      <w:tabs>
+        <w:tab w:val="center" w:pos="4513"/>
+        <w:tab w:val="right" w:pos="9026"/>
+      </w:tabs>
+      <w:spacing w:after="0" w:line="240" w:lineRule="auto"/>
+    </w:pPr>
+  </w:style>
+  <w:style w:type="character" w:customStyle="1" w:styleId="HeaderChar">
+    <w:name w:val="Header Char"/>
+    <w:basedOn w:val="DefaultParagraphFont"/>
+    <w:link w:val="Header"/>
+    <w:uiPriority w:val="99"/>
+    <w:rsid w:val="007973AB"/>
+  </w:style>
+  <w:style w:type="paragraph" w:styleId="Footer">
+    <w:name w:val="footer"/>
+    <w:basedOn w:val="Normal"/>
+    <w:link w:val="FooterChar"/>
+    <w:uiPriority w:val="99"/>
+    <w:unhideWhenUsed/>
+    <w:rsid w:val="007973AB"/>
+    <w:pPr>
+      <w:tabs>
+        <w:tab w:val="center" w:pos="4513"/>
+        <w:tab w:val="right" w:pos="9026"/>
+      </w:tabs>
+      <w:spacing w:after="0" w:line="240" w:lineRule="auto"/>
+    </w:pPr>
+  </w:style>
+  <w:style w:type="character" w:customStyle="1" w:styleId="FooterChar">
+    <w:name w:val="Footer Char"/>
+    <w:basedOn w:val="DefaultParagraphFont"/>
+    <w:link w:val="Footer"/>
+    <w:uiPriority w:val="99"/>
+    <w:rsid w:val="007973AB"/>
+  </w:style>
 </w:styles>
 </file>
 

</xml_diff>